<commit_message>
feat: Restructure paragraph split to only use newlines and fix double-digit Chinese numeral list markers
</commit_message>
<xml_diff>
--- a/第一章/第一章.docx
+++ b/第一章/第一章.docx
@@ -2710,31 +2710,16 @@
     <w:p>
       <w:pPr>
         <w:pStyle w:val="a9"/>
-        <w:ind w:left="720" w:hanging="720"/>
-        <w:jc w:val="both"/>
-      </w:pPr>
-      <w:r>
-        <w:rPr>
-          <w:rFonts w:ascii="新細明體" w:hAnsi="新細明體" w:eastAsia="新細明體"/>
-          <w:b w:val="0"/>
-          <w:sz w:val="24"/>
-        </w:rPr>
-        <w:t>十</w:t>
-      </w:r>
-    </w:p>
-    <w:p>
-      <w:pPr>
-        <w:pStyle w:val="a9"/>
-        <w:ind w:left="720" w:hanging="480"/>
-        <w:jc w:val="both"/>
-      </w:pPr>
-      <w:r>
-        <w:rPr>
-          <w:rFonts w:ascii="新細明體" w:hAnsi="新細明體" w:eastAsia="新細明體"/>
-          <w:b w:val="0"/>
-          <w:sz w:val="24"/>
-        </w:rPr>
-        <w:t>一、外國財物或勞務之認定(外國廠商參與非條約協定採購處理辦法第四條第一項)</w:t>
+        <w:ind w:left="720" w:hanging="480"/>
+        <w:jc w:val="both"/>
+      </w:pPr>
+      <w:r>
+        <w:rPr>
+          <w:rFonts w:ascii="新細明體" w:hAnsi="新細明體" w:eastAsia="新細明體"/>
+          <w:b w:val="0"/>
+          <w:sz w:val="24"/>
+        </w:rPr>
+        <w:t>十一、外國財物或勞務之認定(外國廠商參與非條約協定採購處理辦法第四條第一項)</w:t>
       </w:r>
     </w:p>
     <w:p>
@@ -2785,61 +2770,31 @@
     <w:p>
       <w:pPr>
         <w:pStyle w:val="a9"/>
-        <w:ind w:left="720" w:hanging="720"/>
-        <w:jc w:val="both"/>
-      </w:pPr>
-      <w:r>
-        <w:rPr>
-          <w:rFonts w:ascii="新細明體" w:hAnsi="新細明體" w:eastAsia="新細明體"/>
-          <w:b w:val="0"/>
-          <w:sz w:val="24"/>
-        </w:rPr>
-        <w:t>十</w:t>
-      </w:r>
-    </w:p>
-    <w:p>
-      <w:pPr>
-        <w:pStyle w:val="a9"/>
-        <w:ind w:left="720" w:hanging="480"/>
-        <w:jc w:val="both"/>
-      </w:pPr>
-      <w:r>
-        <w:rPr>
-          <w:rFonts w:ascii="新細明體" w:hAnsi="新細明體" w:eastAsia="新細明體"/>
-          <w:b w:val="0"/>
-          <w:sz w:val="24"/>
-        </w:rPr>
-        <w:t>二、遵行雙邊協議事項–臺灣、澎湖、金門、馬祖個別關稅領域與美國政府採購協議（90年8月23日）。</w:t>
-      </w:r>
-    </w:p>
-    <w:p>
-      <w:pPr>
-        <w:pStyle w:val="a9"/>
-        <w:ind w:left="720" w:hanging="720"/>
-        <w:jc w:val="both"/>
-      </w:pPr>
-      <w:r>
-        <w:rPr>
-          <w:rFonts w:ascii="新細明體" w:hAnsi="新細明體" w:eastAsia="新細明體"/>
-          <w:b w:val="0"/>
-          <w:sz w:val="24"/>
-        </w:rPr>
-        <w:t>十</w:t>
-      </w:r>
-    </w:p>
-    <w:p>
-      <w:pPr>
-        <w:pStyle w:val="a9"/>
-        <w:ind w:left="720" w:hanging="480"/>
-        <w:jc w:val="both"/>
-      </w:pPr>
-      <w:r>
-        <w:rPr>
-          <w:rFonts w:ascii="新細明體" w:hAnsi="新細明體" w:eastAsia="新細明體"/>
-          <w:b w:val="0"/>
-          <w:sz w:val="24"/>
-        </w:rPr>
-        <w:t>三、正確傳輸招標決標資訊至工程會網站。</w:t>
+        <w:ind w:left="720" w:hanging="480"/>
+        <w:jc w:val="both"/>
+      </w:pPr>
+      <w:r>
+        <w:rPr>
+          <w:rFonts w:ascii="新細明體" w:hAnsi="新細明體" w:eastAsia="新細明體"/>
+          <w:b w:val="0"/>
+          <w:sz w:val="24"/>
+        </w:rPr>
+        <w:t>十二、遵行雙邊協議事項–臺灣、澎湖、金門、馬祖個別關稅領域與美國政府採購協議（90年8月23日）。</w:t>
+      </w:r>
+    </w:p>
+    <w:p>
+      <w:pPr>
+        <w:pStyle w:val="a9"/>
+        <w:ind w:left="720" w:hanging="480"/>
+        <w:jc w:val="both"/>
+      </w:pPr>
+      <w:r>
+        <w:rPr>
+          <w:rFonts w:ascii="新細明體" w:hAnsi="新細明體" w:eastAsia="新細明體"/>
+          <w:b w:val="0"/>
+          <w:sz w:val="24"/>
+        </w:rPr>
+        <w:t>十三、正確傳輸招標決標資訊至工程會網站。</w:t>
       </w:r>
     </w:p>
     <w:p/>
@@ -3853,22 +3808,7 @@
           <w:b w:val="0"/>
           <w:sz w:val="24"/>
         </w:rPr>
-        <w:t>一、依GPA委員會1996年3月5日GPA第1號決議附件三（GPA/1 Annex 3），GPA締約國需換算其開放清單附錄1之門檻金額為該國貨幣，並通知GPA委員會，該門檻金額自新年度1月1日起維持固定兩年不變。</w:t>
-      </w:r>
-    </w:p>
-    <w:p>
-      <w:pPr>
-        <w:pStyle w:val="a9"/>
-        <w:ind w:left="720" w:hanging="480"/>
-        <w:jc w:val="both"/>
-      </w:pPr>
-      <w:r>
-        <w:rPr>
-          <w:rFonts w:ascii="新細明體" w:hAnsi="新細明體" w:eastAsia="新細明體"/>
-          <w:b w:val="0"/>
-          <w:sz w:val="24"/>
-        </w:rPr>
-        <w:t>二、我國本次換算金額效期自2011年1月1日起至2012年12月31日止。</w:t>
+        <w:t>一、依GPA委員會1996年3月5日GPA第1號決議附件三（GPA/1 Annex 3），GPA締約國需換算其開放清單附錄1之門檻金額為該國貨幣，並通知GPA委員會，該門檻金額自新年度1月1日起維持固定兩年不變。二、我國本次換算金額效期自2011年1月1日起至2012年12月31日止。</w:t>
       </w:r>
     </w:p>
     <w:p/>
@@ -7375,37 +7315,7 @@
           <w:b w:val="0"/>
           <w:sz w:val="24"/>
         </w:rPr>
-        <w:t>（二）依促參法第11條第9款規定：「主辦機關與民間機構簽訂投資契約，應依個案特性，記載下列事項：……</w:t>
-      </w:r>
-    </w:p>
-    <w:p>
-      <w:pPr>
-        <w:pStyle w:val="a9"/>
-        <w:ind w:left="720" w:hanging="480"/>
-        <w:jc w:val="both"/>
-      </w:pPr>
-      <w:r>
-        <w:rPr>
-          <w:rFonts w:ascii="新細明體" w:hAnsi="新細明體" w:eastAsia="新細明體"/>
-          <w:b w:val="0"/>
-          <w:sz w:val="24"/>
-        </w:rPr>
-        <w:t>九、其他約定事項」，及其施行細則第22條之3第1款規定：「本法第11條第9款所定其他約定事項，得包括下列事項：</w:t>
-      </w:r>
-    </w:p>
-    <w:p>
-      <w:pPr>
-        <w:pStyle w:val="a9"/>
-        <w:ind w:left="720" w:hanging="480"/>
-        <w:jc w:val="both"/>
-      </w:pPr>
-      <w:r>
-        <w:rPr>
-          <w:rFonts w:ascii="新細明體" w:hAnsi="新細明體" w:eastAsia="新細明體"/>
-          <w:b w:val="0"/>
-          <w:sz w:val="24"/>
-        </w:rPr>
-        <w:t>一、雙方聲明及承諾事項。……」，上開委託管理契約有關營運資產有償移轉之約定，如係屬前揭促參法規定投資契約之記載事項，則於終止契約後就廠商於營運期間內所購置之營運資產辦理有償移轉，應屬參與公共建設投資契約履約事項，不適用採購法。</w:t>
+        <w:t>（二）依促參法第11條第9款規定：「主辦機關與民間機構簽訂投資契約，應依個案特性，記載下列事項：……九、其他約定事項」，及其施行細則第22條之3第1款規定：「本法第11條第9款所定其他約定事項，得包括下列事項：一、雙方聲明及承諾事項。……」，上開委託管理契約有關營運資產有償移轉之約定，如係屬前揭促參法規定投資契約之記載事項，則於終止契約後就廠商於營運期間內所購置之營運資產辦理有償移轉，應屬參與公共建設投資契約履約事項，不適用採購法。</w:t>
       </w:r>
     </w:p>
     <w:p/>
@@ -8330,52 +8240,7 @@
           <w:b w:val="0"/>
           <w:sz w:val="24"/>
         </w:rPr>
-        <w:t>（一）國有財產部分，按國有財產法第1條規定：「國有財產之取得、保管、使用、收益及處分，依本法之規定；本法未規定者，適用其他法律。」第47條第2項並規定：「財政部國有財產局得以委託、合作或信託方式，配合區域計畫、都市計畫辦理左列事項︰</w:t>
-      </w:r>
-    </w:p>
-    <w:p>
-      <w:pPr>
-        <w:pStyle w:val="a9"/>
-        <w:ind w:left="720" w:hanging="480"/>
-        <w:jc w:val="both"/>
-      </w:pPr>
-      <w:r>
-        <w:rPr>
-          <w:rFonts w:ascii="新細明體" w:hAnsi="新細明體" w:eastAsia="新細明體"/>
-          <w:b w:val="0"/>
-          <w:sz w:val="24"/>
-        </w:rPr>
-        <w:t>一、改良土地。</w:t>
-      </w:r>
-    </w:p>
-    <w:p>
-      <w:pPr>
-        <w:pStyle w:val="a9"/>
-        <w:ind w:left="720" w:hanging="480"/>
-        <w:jc w:val="both"/>
-      </w:pPr>
-      <w:r>
-        <w:rPr>
-          <w:rFonts w:ascii="新細明體" w:hAnsi="新細明體" w:eastAsia="新細明體"/>
-          <w:b w:val="0"/>
-          <w:sz w:val="24"/>
-        </w:rPr>
-        <w:t>二、興建公務或公共用房屋。</w:t>
-      </w:r>
-    </w:p>
-    <w:p>
-      <w:pPr>
-        <w:pStyle w:val="a9"/>
-        <w:ind w:left="720" w:hanging="480"/>
-        <w:jc w:val="both"/>
-      </w:pPr>
-      <w:r>
-        <w:rPr>
-          <w:rFonts w:ascii="新細明體" w:hAnsi="新細明體" w:eastAsia="新細明體"/>
-          <w:b w:val="0"/>
-          <w:sz w:val="24"/>
-        </w:rPr>
-        <w:t>三、其他非興建房屋之事業。」實務執行方式包括：（A）設定地上權：財政部訂有「國有非公用土地設定地上權作業要點」，（B）參與都市更新：依「都市更新條例」辦理，（C）合作共同開發：依前述國有財產法第47條及其施行細則第48條辦理者，若有相關規定，不適用採購法。</w:t>
+        <w:t>（一）國有財產部分，按國有財產法第1條規定：「國有財產之取得、保管、使用、收益及處分，依本法之規定；本法未規定者，適用其他法律。」第47條第2項並規定：「財政部國有財產局得以委託、合作或信託方式，配合區域計畫、都市計畫辦理左列事項︰一、改良土地。二、興建公務或公共用房屋。三、其他非興建房屋之事業。」實務執行方式包括：（A）設定地上權：財政部訂有「國有非公用土地設定地上權作業要點」，（B）參與都市更新：依「都市更新條例」辦理，（C）合作共同開發：依前述國有財產法第47條及其施行細則第48條辦理者，若有相關規定，不適用採購法。</w:t>
       </w:r>
     </w:p>
     <w:p>
@@ -9168,127 +9033,7 @@
           <w:b w:val="0"/>
           <w:sz w:val="24"/>
         </w:rPr>
-        <w:t>說明：本會八十八年八月三十一日 (八八)工程企字第八八一〇六三四號函答復貴部八十八年七月十六日台(八八)內社字第八八二五七九Ｏ號函及高雄市政府社會局八十八年七月二日高市社局秘字第一九Ｏ二六號所提「高雄市政府社會局暨所屬各機關對政府採購法意見彙整表」項次</w:t>
-      </w:r>
-    </w:p>
-    <w:p>
-      <w:pPr>
-        <w:pStyle w:val="a9"/>
-        <w:ind w:left="720" w:hanging="480"/>
-        <w:jc w:val="both"/>
-      </w:pPr>
-      <w:r>
-        <w:rPr>
-          <w:rFonts w:ascii="新細明體" w:hAnsi="新細明體" w:eastAsia="新細明體"/>
-          <w:b w:val="0"/>
-          <w:sz w:val="24"/>
-        </w:rPr>
-        <w:t>四、</w:t>
-      </w:r>
-    </w:p>
-    <w:p>
-      <w:pPr>
-        <w:pStyle w:val="a9"/>
-        <w:ind w:left="720" w:hanging="480"/>
-        <w:jc w:val="both"/>
-      </w:pPr>
-      <w:r>
-        <w:rPr>
-          <w:rFonts w:ascii="新細明體" w:hAnsi="新細明體" w:eastAsia="新細明體"/>
-          <w:b w:val="0"/>
-          <w:sz w:val="24"/>
-        </w:rPr>
-        <w:t>五、</w:t>
-      </w:r>
-    </w:p>
-    <w:p>
-      <w:pPr>
-        <w:pStyle w:val="a9"/>
-        <w:ind w:left="720" w:hanging="480"/>
-        <w:jc w:val="both"/>
-      </w:pPr>
-      <w:r>
-        <w:rPr>
-          <w:rFonts w:ascii="新細明體" w:hAnsi="新細明體" w:eastAsia="新細明體"/>
-          <w:b w:val="0"/>
-          <w:sz w:val="24"/>
-        </w:rPr>
-        <w:t>七、</w:t>
-      </w:r>
-    </w:p>
-    <w:p>
-      <w:pPr>
-        <w:pStyle w:val="a9"/>
-        <w:ind w:left="720" w:hanging="480"/>
-        <w:jc w:val="both"/>
-      </w:pPr>
-      <w:r>
-        <w:rPr>
-          <w:rFonts w:ascii="新細明體" w:hAnsi="新細明體" w:eastAsia="新細明體"/>
-          <w:b w:val="0"/>
-          <w:sz w:val="24"/>
-        </w:rPr>
-        <w:t>九、十等五項建議，諒達；另項次</w:t>
-      </w:r>
-    </w:p>
-    <w:p>
-      <w:pPr>
-        <w:pStyle w:val="a9"/>
-        <w:ind w:left="720" w:hanging="480"/>
-        <w:jc w:val="both"/>
-      </w:pPr>
-      <w:r>
-        <w:rPr>
-          <w:rFonts w:ascii="新細明體" w:hAnsi="新細明體" w:eastAsia="新細明體"/>
-          <w:b w:val="0"/>
-          <w:sz w:val="24"/>
-        </w:rPr>
-        <w:t>一、</w:t>
-      </w:r>
-    </w:p>
-    <w:p>
-      <w:pPr>
-        <w:pStyle w:val="a9"/>
-        <w:ind w:left="720" w:hanging="480"/>
-        <w:jc w:val="both"/>
-      </w:pPr>
-      <w:r>
-        <w:rPr>
-          <w:rFonts w:ascii="新細明體" w:hAnsi="新細明體" w:eastAsia="新細明體"/>
-          <w:b w:val="0"/>
-          <w:sz w:val="24"/>
-        </w:rPr>
-        <w:t>二、</w:t>
-      </w:r>
-    </w:p>
-    <w:p>
-      <w:pPr>
-        <w:pStyle w:val="a9"/>
-        <w:ind w:left="720" w:hanging="480"/>
-        <w:jc w:val="both"/>
-      </w:pPr>
-      <w:r>
-        <w:rPr>
-          <w:rFonts w:ascii="新細明體" w:hAnsi="新細明體" w:eastAsia="新細明體"/>
-          <w:b w:val="0"/>
-          <w:sz w:val="24"/>
-        </w:rPr>
-        <w:t>三、</w:t>
-      </w:r>
-    </w:p>
-    <w:p>
-      <w:pPr>
-        <w:pStyle w:val="a9"/>
-        <w:ind w:left="720" w:hanging="480"/>
-        <w:jc w:val="both"/>
-      </w:pPr>
-      <w:r>
-        <w:rPr>
-          <w:rFonts w:ascii="新細明體" w:hAnsi="新細明體" w:eastAsia="新細明體"/>
-          <w:b w:val="0"/>
-          <w:sz w:val="24"/>
-        </w:rPr>
-        <w:t>六、八等五項，答復如附件。</w:t>
+        <w:t>說明：本會八十八年八月三十一日 (八八)工程企字第八八一〇六三四號函答復貴部八十八年七月十六日台(八八)內社字第八八二五七九Ｏ號函及高雄市政府社會局八十八年七月二日高市社局秘字第一九Ｏ二六號所提「高雄市政府社會局暨所屬各機關對政府採購法意見彙整表」項次四、五、七、九、十等五項建議，諒達；另項次一、二、三、六、八等五項，答復如附件。</w:t>
       </w:r>
     </w:p>
     <w:p>
@@ -10521,15 +10266,80 @@
           <w:sz w:val="24"/>
         </w:rPr>
         <w:t>主旨：貴署函詢國有非公用不動產使用補償金之金錢債權經查得債務人所有之不動產，聲請強制執行拍賣無人應買，擬承受法院未能拍定之不動產，是否適用政府採購法(下稱採購法)，詳如說明，請查照。</w:t>
-        <w:br/>
-        <w:t>說明：</w:t>
-        <w:br/>
+      </w:r>
+    </w:p>
+    <w:p>
+      <w:pPr>
+        <w:pStyle w:val="a9"/>
+        <w:ind w:left="720" w:hanging="720"/>
+        <w:jc w:val="both"/>
+      </w:pPr>
+      <w:r>
+        <w:rPr>
+          <w:rFonts w:ascii="新細明體" w:hAnsi="新細明體" w:eastAsia="新細明體"/>
+          <w:b w:val="0"/>
+          <w:sz w:val="24"/>
+        </w:rPr>
+        <w:t>說明：</w:t>
+      </w:r>
+    </w:p>
+    <w:p>
+      <w:pPr>
+        <w:pStyle w:val="a9"/>
+        <w:ind w:left="720" w:hanging="480"/>
+        <w:jc w:val="both"/>
+      </w:pPr>
+      <w:r>
+        <w:rPr>
+          <w:rFonts w:ascii="新細明體" w:hAnsi="新細明體" w:eastAsia="新細明體"/>
+          <w:b w:val="0"/>
+          <w:sz w:val="24"/>
+        </w:rPr>
         <w:t>一、復貴署110年1月29日台財產署管字第11040000820號函。</w:t>
-        <w:br/>
+      </w:r>
+    </w:p>
+    <w:p>
+      <w:pPr>
+        <w:pStyle w:val="a9"/>
+        <w:ind w:left="720" w:hanging="480"/>
+        <w:jc w:val="both"/>
+      </w:pPr>
+      <w:r>
+        <w:rPr>
+          <w:rFonts w:ascii="新細明體" w:hAnsi="新細明體" w:eastAsia="新細明體"/>
+          <w:b w:val="0"/>
+          <w:sz w:val="24"/>
+        </w:rPr>
         <w:t>二、按採購法第2條規定：「本法所稱採購，指工程之定作、財物之買受、定製、承租及勞務之委任或僱傭等。」機關辦理採購目的，源於機關對採購標的之需求；機關依強制執行法之規定，承受法院未能拍定之不動產或動產，係為滿足其債權獲得清償之目的，與政府採購本質有別。</w:t>
-        <w:br/>
+      </w:r>
+    </w:p>
+    <w:p>
+      <w:pPr>
+        <w:pStyle w:val="a9"/>
+        <w:ind w:left="720" w:hanging="480"/>
+        <w:jc w:val="both"/>
+      </w:pPr>
+      <w:r>
+        <w:rPr>
+          <w:rFonts w:ascii="新細明體" w:hAnsi="新細明體" w:eastAsia="新細明體"/>
+          <w:b w:val="0"/>
+          <w:sz w:val="24"/>
+        </w:rPr>
         <w:t>三、機關承受法院未能拍定之動產或不動產，就拍賣物之底價訂定等程序，強制執行法已有特別規定，爰機關依強制執行法承受，不適用採購法。</w:t>
-        <w:br/>
+      </w:r>
+    </w:p>
+    <w:p>
+      <w:pPr>
+        <w:pStyle w:val="a9"/>
+        <w:ind w:left="720" w:hanging="480"/>
+        <w:jc w:val="both"/>
+      </w:pPr>
+      <w:r>
+        <w:rPr>
+          <w:rFonts w:ascii="新細明體" w:hAnsi="新細明體" w:eastAsia="新細明體"/>
+          <w:b w:val="0"/>
+          <w:sz w:val="24"/>
+        </w:rPr>
         <w:t>四、來函援引本會89年3月8日(89)工程企字第89004915號函說明三，即日起停止適用。</w:t>
       </w:r>
     </w:p>
@@ -12643,16 +12453,31 @@
     <w:p>
       <w:pPr>
         <w:pStyle w:val="a9"/>
-        <w:ind w:left="720" w:hanging="720"/>
-        <w:jc w:val="both"/>
-      </w:pPr>
-      <w:r>
-        <w:rPr>
-          <w:rFonts w:ascii="新細明體" w:hAnsi="新細明體" w:eastAsia="新細明體"/>
-          <w:b w:val="0"/>
-          <w:sz w:val="24"/>
-        </w:rPr>
-        <w:t>備註：1. 依九十一年二月六日總統華總一義字第Ｏ九一ＯＯＯ二五六一Ｏ號令修正公布之政府採購法第二十二條第一項規定，符合該條第一項各款情形之採購，得採限制性招標，免報經上級機關核准。108年5月22日總統華總一義字第10800049691號令修正公布政府採購法部分條文，其第22條第1項第9款規定，增列「社會福利服務」為本款適用範圍。另108年11月22日本會和衛生福利部會銜訂定發布「機關委託社會福利服務廠商評選及計費辦法」。</w:t>
+        <w:ind w:left="960" w:hanging="960"/>
+        <w:jc w:val="both"/>
+      </w:pPr>
+      <w:r>
+        <w:rPr>
+          <w:rFonts w:ascii="新細明體" w:hAnsi="新細明體" w:eastAsia="新細明體"/>
+          <w:b w:val="0"/>
+          <w:sz w:val="24"/>
+        </w:rPr>
+        <w:t>備註：1. 依九十一年二月六日總統華總一義字第Ｏ九一ＯＯＯ二五六一Ｏ號令修正公布之政府採購法第二十二條第一項規定，符合該條第一項各款情形之採購，得採限制性招標，免報經上級機關核准。</w:t>
+      </w:r>
+    </w:p>
+    <w:p>
+      <w:pPr>
+        <w:pStyle w:val="a9"/>
+        <w:ind w:left="960" w:hanging="240"/>
+        <w:jc w:val="both"/>
+      </w:pPr>
+      <w:r>
+        <w:rPr>
+          <w:rFonts w:ascii="新細明體" w:hAnsi="新細明體" w:eastAsia="新細明體"/>
+          <w:b w:val="0"/>
+          <w:sz w:val="24"/>
+        </w:rPr>
+        <w:t>2. 108年5月22日總統華總一義字第10800049691號令修正公布政府採購法部分條文，其第22條第1項第9款規定，增列「社會福利服務」為本款適用範圍。另108年11月22日本會和衛生福利部會銜訂定發布「機關委託社會福利服務廠商評選及計費辦法」。</w:t>
       </w:r>
     </w:p>
     <w:p/>
@@ -16022,22 +15847,7 @@
           <w:b w:val="0"/>
           <w:sz w:val="24"/>
         </w:rPr>
-        <w:t>一、依據104年1月23日立法院第8屆第6會期第19次會議通過之「中華民國104年度中央政府總預算案審查總報告（修正版）」伍、審議總結果之</w:t>
-      </w:r>
-    </w:p>
-    <w:p>
-      <w:pPr>
-        <w:pStyle w:val="a9"/>
-        <w:ind w:left="720" w:hanging="480"/>
-        <w:jc w:val="both"/>
-      </w:pPr>
-      <w:r>
-        <w:rPr>
-          <w:rFonts w:ascii="新細明體" w:hAnsi="新細明體" w:eastAsia="新細明體"/>
-          <w:b w:val="0"/>
-          <w:sz w:val="24"/>
-        </w:rPr>
-        <w:t>八、通案決議事項（九）辦理。</w:t>
+        <w:t>一、依據104年1月23日立法院第8屆第6會期第19次會議通過之「中華民國104年度中央政府總預算案審查總報告（修正版）」伍、審議總結果之八、通案決議事項（九）辦理。</w:t>
       </w:r>
     </w:p>
     <w:p>
@@ -16447,22 +16257,7 @@
           <w:b w:val="0"/>
           <w:sz w:val="24"/>
         </w:rPr>
-        <w:t>四、作業規定第四點第三項所稱之「使用期間」，尚非指「使用年限」。例如，使用年限內最後一次提報時，使用期間未及於一年者，即適用該項規定。</w:t>
-      </w:r>
-    </w:p>
-    <w:p>
-      <w:pPr>
-        <w:pStyle w:val="a9"/>
-        <w:ind w:left="720" w:hanging="480"/>
-        <w:jc w:val="both"/>
-      </w:pPr>
-      <w:r>
-        <w:rPr>
-          <w:rFonts w:ascii="新細明體" w:hAnsi="新細明體" w:eastAsia="新細明體"/>
-          <w:b w:val="0"/>
-          <w:sz w:val="24"/>
-        </w:rPr>
-        <w:t>五、目前尚未有依作業規定提報之案例。未來本會將依政府採購法第一百十一條第二項規定，對已完成之重大採購事件，作出效益評估，除應秘密者外，並將刊登於政府採購公報。</w:t>
+        <w:t>四、作業規定第四點第三項所稱之「使用期間」，尚非指「使用年限」。例如，使用年限內最後一次提報時，使用期間未及於一年者，即適用該項規定。五、目前尚未有依作業規定提報之案例。未來本會將依政府採購法第一百十一條第二項規定，對已完成之重大採購事件，作出效益評估，除應秘密者外，並將刊登於政府採購公報。</w:t>
       </w:r>
     </w:p>
     <w:p/>
@@ -28200,22 +27995,7 @@
           <w:b w:val="0"/>
           <w:sz w:val="24"/>
         </w:rPr>
-        <w:t>二、有關營業項目乙節，請參閱本會九十年十二月廿六日(九十)工程企字第九００五一四八四號函附會議紀錄（已公開於本會網站）。</w:t>
-      </w:r>
-    </w:p>
-    <w:p>
-      <w:pPr>
-        <w:pStyle w:val="a9"/>
-        <w:ind w:left="720" w:hanging="480"/>
-        <w:jc w:val="both"/>
-      </w:pPr>
-      <w:r>
-        <w:rPr>
-          <w:rFonts w:ascii="新細明體" w:hAnsi="新細明體" w:eastAsia="新細明體"/>
-          <w:b w:val="0"/>
-          <w:sz w:val="24"/>
-        </w:rPr>
-        <w:t>三、目前政府財政困難，各機關使用預算辦理採購，本應依編定該預算之原始目的撙節開支。貴校利用旨揭剩餘款採購宣導Ｔ侐及資料袋(公事包)是否妥適，請審慎檢討。</w:t>
+        <w:t>二、有關營業項目乙節，請參閱本會九十年十二月廿六日(九十)工程企字第九００五一四八四號函附會議紀錄（已公開於本會網站）。三、目前政府財政困難，各機關使用預算辦理採購，本應依編定該預算之原始目的撙節開支。貴校利用旨揭剩餘款採購宣導Ｔ侐及資料袋(公事包)是否妥適，請審慎檢討。</w:t>
       </w:r>
     </w:p>
     <w:p/>
@@ -30844,22 +30624,7 @@
           <w:b w:val="0"/>
           <w:sz w:val="24"/>
         </w:rPr>
-        <w:t>三、關於中央專案補助之災後復健工程經費，應專款專用，不得挪作他用，亦不得因統收統支而就此等工程於招標公告及契約載明與申請補助款程序無關之「預計延遲付款月數」。本會100年10月20日工程企字第10000398230號函檢送之「機關辦理工程採購常見遲延付款缺失態樣」序號</w:t>
-      </w:r>
-    </w:p>
-    <w:p>
-      <w:pPr>
-        <w:pStyle w:val="a9"/>
-        <w:ind w:left="720" w:hanging="480"/>
-        <w:jc w:val="both"/>
-      </w:pPr>
-      <w:r>
-        <w:rPr>
-          <w:rFonts w:ascii="新細明體" w:hAnsi="新細明體" w:eastAsia="新細明體"/>
-          <w:b w:val="0"/>
-          <w:sz w:val="24"/>
-        </w:rPr>
-        <w:t>二、（一）所載缺失態樣：「將工程預算或補助款挪作他用，或預算調度不及，致無預算及時支付工程款。」（公開於本會網站），併請查察。</w:t>
+        <w:t>三、關於中央專案補助之災後復健工程經費，應專款專用，不得挪作他用，亦不得因統收統支而就此等工程於招標公告及契約載明與申請補助款程序無關之「預計延遲付款月數」。本會100年10月20日工程企字第10000398230號函檢送之「機關辦理工程採購常見遲延付款缺失態樣」序號二、（一）所載缺失態樣：「將工程預算或補助款挪作他用，或預算調度不及，致無預算及時支付工程款。」（公開於本會網站），併請查察。</w:t>
       </w:r>
     </w:p>
     <w:p/>
@@ -31283,67 +31048,7 @@
           <w:b w:val="0"/>
           <w:sz w:val="24"/>
         </w:rPr>
-        <w:t>（一）技服辦法第25條規定：「機關委託廠商辦理技術服務，其服務費用之計算，應視技術服務類別、性質、規模、工作範圍、工作區域、工作環境或工作期限等情形，就下列方式擇定一種或二種以上符合需要者訂明於契約：</w:t>
-      </w:r>
-    </w:p>
-    <w:p>
-      <w:pPr>
-        <w:pStyle w:val="a9"/>
-        <w:ind w:left="720" w:hanging="480"/>
-        <w:jc w:val="both"/>
-      </w:pPr>
-      <w:r>
-        <w:rPr>
-          <w:rFonts w:ascii="新細明體" w:hAnsi="新細明體" w:eastAsia="新細明體"/>
-          <w:b w:val="0"/>
-          <w:sz w:val="24"/>
-        </w:rPr>
-        <w:t>一、服務成本加公費法。</w:t>
-      </w:r>
-    </w:p>
-    <w:p>
-      <w:pPr>
-        <w:pStyle w:val="a9"/>
-        <w:ind w:left="720" w:hanging="480"/>
-        <w:jc w:val="both"/>
-      </w:pPr>
-      <w:r>
-        <w:rPr>
-          <w:rFonts w:ascii="新細明體" w:hAnsi="新細明體" w:eastAsia="新細明體"/>
-          <w:b w:val="0"/>
-          <w:sz w:val="24"/>
-        </w:rPr>
-        <w:t>二、建造費用百分比法。</w:t>
-      </w:r>
-    </w:p>
-    <w:p>
-      <w:pPr>
-        <w:pStyle w:val="a9"/>
-        <w:ind w:left="720" w:hanging="480"/>
-        <w:jc w:val="both"/>
-      </w:pPr>
-      <w:r>
-        <w:rPr>
-          <w:rFonts w:ascii="新細明體" w:hAnsi="新細明體" w:eastAsia="新細明體"/>
-          <w:b w:val="0"/>
-          <w:sz w:val="24"/>
-        </w:rPr>
-        <w:t>三、按月、按日或按時計酬法。</w:t>
-      </w:r>
-    </w:p>
-    <w:p>
-      <w:pPr>
-        <w:pStyle w:val="a9"/>
-        <w:ind w:left="720" w:hanging="480"/>
-        <w:jc w:val="both"/>
-      </w:pPr>
-      <w:r>
-        <w:rPr>
-          <w:rFonts w:ascii="新細明體" w:hAnsi="新細明體" w:eastAsia="新細明體"/>
-          <w:b w:val="0"/>
-          <w:sz w:val="24"/>
-        </w:rPr>
-        <w:t>四、總包價法或單價計算法(第1項)。依前項計算之服務費用，應參酌一般收費情形核實議定。其必須核實另支費用者，應於契約內訂明項目及費用範圍(第2項)。」</w:t>
+        <w:t>（一）技服辦法第25條規定：「機關委託廠商辦理技術服務，其服務費用之計算，應視技術服務類別、性質、規模、工作範圍、工作區域、工作環境或工作期限等情形，就下列方式擇定一種或二種以上符合需要者訂明於契約：一、服務成本加公費法。二、建造費用百分比法。三、按月、按日或按時計酬法。四、總包價法或單價計算法(第1項)。依前項計算之服務費用，應參酌一般收費情形核實議定。其必須核實另支費用者，應於契約內訂明項目及費用範圍(第2項)。」</w:t>
       </w:r>
     </w:p>
     <w:p>
@@ -32610,22 +32315,7 @@
           <w:b w:val="0"/>
           <w:sz w:val="24"/>
         </w:rPr>
-        <w:t>２、請依「中央各主管機關編製110年度概算應行注意辦理事項」</w:t>
-      </w:r>
-    </w:p>
-    <w:p>
-      <w:pPr>
-        <w:pStyle w:val="a9"/>
-        <w:ind w:left="720" w:hanging="480"/>
-        <w:jc w:val="both"/>
-      </w:pPr>
-      <w:r>
-        <w:rPr>
-          <w:rFonts w:ascii="新細明體" w:hAnsi="新細明體" w:eastAsia="新細明體"/>
-          <w:b w:val="0"/>
-          <w:sz w:val="24"/>
-        </w:rPr>
-        <w:t>四、（一）、19規定，通知受補助地方政府，並請其列入年度預算辦理。</w:t>
+        <w:t>２、請依「中央各主管機關編製110年度概算應行注意辦理事項」四、（一）、19規定，通知受補助地方政府，並請其列入年度預算辦理。</w:t>
       </w:r>
     </w:p>
     <w:p>
@@ -37976,52 +37666,22 @@
           <w:b w:val="0"/>
           <w:sz w:val="24"/>
         </w:rPr>
-        <w:t>二、上開會議紀錄參、</w:t>
-      </w:r>
-    </w:p>
-    <w:p>
-      <w:pPr>
-        <w:pStyle w:val="a9"/>
-        <w:ind w:left="720" w:hanging="480"/>
-        <w:jc w:val="both"/>
-      </w:pPr>
-      <w:r>
-        <w:rPr>
-          <w:rFonts w:ascii="新細明體" w:hAnsi="新細明體" w:eastAsia="新細明體"/>
-          <w:b w:val="0"/>
-          <w:sz w:val="24"/>
-        </w:rPr>
-        <w:t>二、〈四〉內容略以：「機關採購廉政平臺」以往運作績效良好，惟尚未全面普及，因此應要求相關單位凡達一定金額及規模之採購案或重大建設工程，均應成立該平臺，請羅政務委員秉成協助盤整及整合相關部會，並請本院公共工程委員會加強要求，以達監督、制衡、查核之目的。</w:t>
-      </w:r>
-    </w:p>
-    <w:p>
-      <w:pPr>
-        <w:pStyle w:val="a9"/>
-        <w:ind w:left="720" w:hanging="480"/>
-        <w:jc w:val="both"/>
-      </w:pPr>
-      <w:r>
-        <w:rPr>
-          <w:rFonts w:ascii="新細明體" w:hAnsi="新細明體" w:eastAsia="新細明體"/>
-          <w:b w:val="0"/>
-          <w:sz w:val="24"/>
-        </w:rPr>
-        <w:t>三、法務部業依上開會議決議，於111年4月29日法廉字第11105001890號函訂定「機關採購廉政平臺分級開設原則」（如附件），該原則</w:t>
-      </w:r>
-    </w:p>
-    <w:p>
-      <w:pPr>
-        <w:pStyle w:val="a9"/>
-        <w:ind w:left="720" w:hanging="480"/>
-        <w:jc w:val="both"/>
-      </w:pPr>
-      <w:r>
-        <w:rPr>
-          <w:rFonts w:ascii="新細明體" w:hAnsi="新細明體" w:eastAsia="新細明體"/>
-          <w:b w:val="0"/>
-          <w:sz w:val="24"/>
-        </w:rPr>
-        <w:t>三、具體作法（一）載有：「巨額採購金額達新臺幣（下同）一百億元以上案件，配合機關首長需求，由主管機關政風機構報請法務部廉政署同意後，開設機關採購廉政平臺......」。爰各機關辦理一百億元以上採購案，請依上開原則配合機關首長需求，由政風機構報請法務部廉政署同意後，開設採購廉政平臺。</w:t>
+        <w:t>二、上開會議紀錄參、二、〈四〉內容略以：「機關採購廉政平臺」以往運作績效良好，惟尚未全面普及，因此應要求相關單位凡達一定金額及規模之採購案或重大建設工程，均應成立該平臺，請羅政務委員秉成協助盤整及整合相關部會，並請本院公共工程委員會加強要求，以達監督、制衡、查核之目的。</w:t>
+      </w:r>
+    </w:p>
+    <w:p>
+      <w:pPr>
+        <w:pStyle w:val="a9"/>
+        <w:ind w:left="720" w:hanging="480"/>
+        <w:jc w:val="both"/>
+      </w:pPr>
+      <w:r>
+        <w:rPr>
+          <w:rFonts w:ascii="新細明體" w:hAnsi="新細明體" w:eastAsia="新細明體"/>
+          <w:b w:val="0"/>
+          <w:sz w:val="24"/>
+        </w:rPr>
+        <w:t>三、法務部業依上開會議決議，於111年4月29日法廉字第11105001890號函訂定「機關採購廉政平臺分級開設原則」（如附件），該原則三、具體作法（一）載有：「巨額採購金額達新臺幣（下同）一百億元以上案件，配合機關首長需求，由主管機關政風機構報請法務部廉政署同意後，開設機關採購廉政平臺......」。爰各機關辦理一百億元以上採購案，請依上開原則配合機關首長需求，由政風機構報請法務部廉政署同意後，開設採購廉政平臺。</w:t>
       </w:r>
     </w:p>
     <w:p>
@@ -40530,22 +40190,7 @@
           <w:b w:val="0"/>
           <w:sz w:val="24"/>
         </w:rPr>
-        <w:t>二、旨揭目標金額比率，業經會商各機關，並獲經濟部114年3月20日經授企字第11454800630號函表示同意。</w:t>
-      </w:r>
-    </w:p>
-    <w:p>
-      <w:pPr>
-        <w:pStyle w:val="a9"/>
-        <w:ind w:left="720" w:hanging="480"/>
-        <w:jc w:val="both"/>
-      </w:pPr>
-      <w:r>
-        <w:rPr>
-          <w:rFonts w:ascii="新細明體" w:hAnsi="新細明體" w:eastAsia="新細明體"/>
-          <w:b w:val="0"/>
-          <w:sz w:val="24"/>
-        </w:rPr>
-        <w:t>三、目標金額比率計算合理化，計算基礎排除性質不適合中小企業承包之採購案：扶助辦法第4條所稱目標金額比率，其計算基礎應為適合中小企業承包之採購，始為合理，該計算基礎排除性質不適合中小企業承包之採購案，包括適用條約或協定之採購、巨額採購、依各目的法規規定決標對象僅得為非屬中小企業之特定專業人員者（如建築師事務所、律師事務所、會計師事務所等）、辦公室租賃及國外採購案件等相關採購。另考量機關依政府採購法第22條第1項第4款、第7款辦理後續擴充，如原有採購得標廠商非中小企業，後續擴充通常亦非中小企業，該計算基礎一併排除該等原有採購得標廠商非中小企業之後續擴充採購，且得標廠商亦相同之案件。</w:t>
+        <w:t>二、旨揭目標金額比率，業經會商各機關，並獲經濟部114年3月20日經授企字第11454800630號函表示同意。三、目標金額比率計算合理化，計算基礎排除性質不適合中小企業承包之採購案：扶助辦法第4條所稱目標金額比率，其計算基礎應為適合中小企業承包之採購，始為合理，該計算基礎排除性質不適合中小企業承包之採購案，包括適用條約或協定之採購、巨額採購、依各目的法規規定決標對象僅得為非屬中小企業之特定專業人員者（如建築師事務所、律師事務所、會計師事務所等）、辦公室租賃及國外採購案件等相關採購。另考量機關依政府採購法第22條第1項第4款、第7款辦理後續擴充，如原有採購得標廠商非中小企業，後續擴充通常亦非中小企業，該計算基礎一併排除該等原有採購得標廠商非中小企業之後續擴充採購，且得標廠商亦相同之案件。</w:t>
       </w:r>
     </w:p>
     <w:p/>
@@ -40667,22 +40312,7 @@
           <w:b w:val="0"/>
           <w:sz w:val="24"/>
         </w:rPr>
-        <w:t>二、旨揭目標金額比率，業經會商各機關，並獲經濟部115年2月13日經授企字第11554800320號函表示同意。</w:t>
-      </w:r>
-    </w:p>
-    <w:p>
-      <w:pPr>
-        <w:pStyle w:val="a9"/>
-        <w:ind w:left="720" w:hanging="480"/>
-        <w:jc w:val="both"/>
-      </w:pPr>
-      <w:r>
-        <w:rPr>
-          <w:rFonts w:ascii="新細明體" w:hAnsi="新細明體" w:eastAsia="新細明體"/>
-          <w:b w:val="0"/>
-          <w:sz w:val="24"/>
-        </w:rPr>
-        <w:t>三、目標金額比率計算合理化，計算基礎排除性質不適合中小企業承包之採購案：扶助辦法第4條所稱目標金額比率，其計算基礎應為適合中小企業承包之採購，始為合理，該計算基礎排除性質不適合中小企業承包之採購案，包括適用條約協定之採購、巨額採購、駐外機構或海外單位（如海外華僑文教服務中心）辦理之採購案、依各目的法規規定決標對象僅得為非屬中小企業之特定專業人員者（如建築師事務所、律師事務所、會計師事務所、不動產估價師、醫院等，非屬中小企業）、辦公室租賃等相關採購。另考量機關依政府採購法第22條第1項第4款、第7款辦理後續擴充，如原有採購得標廠商非中小企業，後續擴充通常亦非中小企業，該計算基礎一併排除該等原有採購得標廠商非中小企業之後續擴充採購，且得標廠商亦相同之案件。</w:t>
+        <w:t>二、旨揭目標金額比率，業經會商各機關，並獲經濟部115年2月13日經授企字第11554800320號函表示同意。三、目標金額比率計算合理化，計算基礎排除性質不適合中小企業承包之採購案：扶助辦法第4條所稱目標金額比率，其計算基礎應為適合中小企業承包之採購，始為合理，該計算基礎排除性質不適合中小企業承包之採購案，包括適用條約協定之採購、巨額採購、駐外機構或海外單位（如海外華僑文教服務中心）辦理之採購案、依各目的法規規定決標對象僅得為非屬中小企業之特定專業人員者（如建築師事務所、律師事務所、會計師事務所、不動產估價師、醫院等，非屬中小企業）、辦公室租賃等相關採購。另考量機關依政府採購法第22條第1項第4款、第7款辦理後續擴充，如原有採購得標廠商非中小企業，後續擴充通常亦非中小企業，該計算基礎一併排除該等原有採購得標廠商非中小企業之後續擴充採購，且得標廠商亦相同之案件。</w:t>
       </w:r>
     </w:p>
     <w:p/>
@@ -42082,82 +41712,7 @@
           <w:b w:val="0"/>
           <w:sz w:val="24"/>
         </w:rPr>
-        <w:t>３、評選項目部分：建議依「機關委託技術服務廠商評選及計費辦法」第17條第1項規定：「機關委託廠商辦理可行性研究、規劃、設計或監造，其評選項目，除法令另有規定者外，得載明下列事項：</w:t>
-      </w:r>
-    </w:p>
-    <w:p>
-      <w:pPr>
-        <w:pStyle w:val="a9"/>
-        <w:ind w:left="720" w:hanging="480"/>
-        <w:jc w:val="both"/>
-      </w:pPr>
-      <w:r>
-        <w:rPr>
-          <w:rFonts w:ascii="新細明體" w:hAnsi="新細明體" w:eastAsia="新細明體"/>
-          <w:b w:val="0"/>
-          <w:sz w:val="24"/>
-        </w:rPr>
-        <w:t>一、廠商於技術服務項目之經驗及信譽。得包括優良、不良紀錄或事蹟。…</w:t>
-      </w:r>
-    </w:p>
-    <w:p>
-      <w:pPr>
-        <w:pStyle w:val="a9"/>
-        <w:ind w:left="720" w:hanging="480"/>
-        <w:jc w:val="both"/>
-      </w:pPr>
-      <w:r>
-        <w:rPr>
-          <w:rFonts w:ascii="新細明體" w:hAnsi="新細明體" w:eastAsia="新細明體"/>
-          <w:b w:val="0"/>
-          <w:sz w:val="24"/>
-        </w:rPr>
-        <w:t>三、工作計畫、預定進度及如期如質履約能力。得包括主要工作人數及尚在履約之契約件數、金額及是否逾期等情形。</w:t>
-      </w:r>
-    </w:p>
-    <w:p>
-      <w:pPr>
-        <w:pStyle w:val="a9"/>
-        <w:ind w:left="720" w:hanging="480"/>
-        <w:jc w:val="both"/>
-      </w:pPr>
-      <w:r>
-        <w:rPr>
-          <w:rFonts w:ascii="新細明體" w:hAnsi="新細明體" w:eastAsia="新細明體"/>
-          <w:b w:val="0"/>
-          <w:sz w:val="24"/>
-        </w:rPr>
-        <w:t>四、計畫主持人及主要工作人員之經驗、專長、最近三年之服務紀錄及主要工作人員具備本法專業知識之情形。得包括該等人員之優良、不良紀錄或事蹟。…</w:t>
-      </w:r>
-    </w:p>
-    <w:p>
-      <w:pPr>
-        <w:pStyle w:val="a9"/>
-        <w:ind w:left="720" w:hanging="720"/>
-        <w:jc w:val="both"/>
-      </w:pPr>
-      <w:r>
-        <w:rPr>
-          <w:rFonts w:ascii="新細明體" w:hAnsi="新細明體" w:eastAsia="新細明體"/>
-          <w:b w:val="0"/>
-          <w:sz w:val="24"/>
-        </w:rPr>
-        <w:t>十</w:t>
-      </w:r>
-    </w:p>
-    <w:p>
-      <w:pPr>
-        <w:pStyle w:val="a9"/>
-        <w:ind w:left="720" w:hanging="480"/>
-        <w:jc w:val="both"/>
-      </w:pPr>
-      <w:r>
-        <w:rPr>
-          <w:rFonts w:ascii="新細明體" w:hAnsi="新細明體" w:eastAsia="新細明體"/>
-          <w:b w:val="0"/>
-          <w:sz w:val="24"/>
-        </w:rPr>
-        <w:t>二、廠商最近五年曾獲與評選案性質相同或類似之獎勵情形及過去履約績效…」（該辦法於99年4月15日正式施行），將技術服務廠商之相關履約績效納入招標評選項目，並就該廠商所提報之工作計畫、預定進度，考量其如期如質履約能力，衡量指標得包括主要工作人數及尚在履約契約件數、金額與是否逾期等情形。</w:t>
+        <w:t>３、評選項目部分：建議依「機關委託技術服務廠商評選及計費辦法」第17條第1項規定：「機關委託廠商辦理可行性研究、規劃、設計或監造，其評選項目，除法令另有規定者外，得載明下列事項：一、廠商於技術服務項目之經驗及信譽。得包括優良、不良紀錄或事蹟。…三、工作計畫、預定進度及如期如質履約能力。得包括主要工作人數及尚在履約之契約件數、金額及是否逾期等情形。四、計畫主持人及主要工作人員之經驗、專長、最近三年之服務紀錄及主要工作人員具備本法專業知識之情形。得包括該等人員之優良、不良紀錄或事蹟。…十二、廠商最近五年曾獲與評選案性質相同或類似之獎勵情形及過去履約績效…」（該辦法於99年4月15日正式施行），將技術服務廠商之相關履約績效納入招標評選項目，並就該廠商所提報之工作計畫、預定進度，考量其如期如質履約能力，衡量指標得包括主要工作人數及尚在履約契約件數、金額與是否逾期等情形。</w:t>
       </w:r>
     </w:p>
     <w:p>
@@ -43077,22 +42632,7 @@
           <w:b w:val="0"/>
           <w:sz w:val="24"/>
         </w:rPr>
-        <w:t>一、依據行政院秘書長108年1月29日院臺建字第1080163584號函檢送「營建剩餘土石方之去化機制檢討暨台北港填海造陸填埋容量擴增規劃會議」紀錄之結論</w:t>
-      </w:r>
-    </w:p>
-    <w:p>
-      <w:pPr>
-        <w:pStyle w:val="a9"/>
-        <w:ind w:left="720" w:hanging="480"/>
-        <w:jc w:val="both"/>
-      </w:pPr>
-      <w:r>
-        <w:rPr>
-          <w:rFonts w:ascii="新細明體" w:hAnsi="新細明體" w:eastAsia="新細明體"/>
-          <w:b w:val="0"/>
-          <w:sz w:val="24"/>
-        </w:rPr>
-        <w:t>二、(二)略以：營建剩餘土石方去化及管控機制，應積極推行辦理土石方減量及落實營建剩餘土石方後端去化管控作業。</w:t>
+        <w:t>一、依據行政院秘書長108年1月29日院臺建字第1080163584號函檢送「營建剩餘土石方之去化機制檢討暨台北港填海造陸填埋容量擴增規劃會議」紀錄之結論二、(二)略以：營建剩餘土石方去化及管控機制，應積極推行辦理土石方減量及落實營建剩餘土石方後端去化管控作業。</w:t>
       </w:r>
     </w:p>
     <w:p>
@@ -43695,22 +43235,7 @@
           <w:b w:val="0"/>
           <w:sz w:val="24"/>
         </w:rPr>
-        <w:t>二、行政院113年10月30日「行政院經濟發展委員會第 2 次會議(下半場)」報告事項第一案（薪資提升及薪資透明化議題）決定</w:t>
-      </w:r>
-    </w:p>
-    <w:p>
-      <w:pPr>
-        <w:pStyle w:val="a9"/>
-        <w:ind w:left="720" w:hanging="480"/>
-        <w:jc w:val="both"/>
-      </w:pPr>
-      <w:r>
-        <w:rPr>
-          <w:rFonts w:ascii="新細明體" w:hAnsi="新細明體" w:eastAsia="新細明體"/>
-          <w:b w:val="0"/>
-          <w:sz w:val="24"/>
-        </w:rPr>
-        <w:t>三、（一）、1及2：</w:t>
+        <w:t>二、行政院113年10月30日「行政院經濟發展委員會第 2 次會議(下半場)」報告事項第一案（薪資提升及薪資透明化議題）決定三、（一）、1及2：</w:t>
       </w:r>
     </w:p>
     <w:p>
@@ -43800,22 +43325,7 @@
           <w:b w:val="0"/>
           <w:sz w:val="24"/>
         </w:rPr>
-        <w:t>１、得於等標期間變更或補充招標文件，比照上開說明</w:t>
-      </w:r>
-    </w:p>
-    <w:p>
-      <w:pPr>
-        <w:pStyle w:val="a9"/>
-        <w:ind w:left="720" w:hanging="480"/>
-        <w:jc w:val="both"/>
-      </w:pPr>
-      <w:r>
-        <w:rPr>
-          <w:rFonts w:ascii="新細明體" w:hAnsi="新細明體" w:eastAsia="新細明體"/>
-          <w:b w:val="0"/>
-          <w:sz w:val="24"/>
-        </w:rPr>
-        <w:t>三、(一)辦理，並依招標期限標準第7條第1項之規定，視需要延長等標期。</w:t>
+        <w:t>１、得於等標期間變更或補充招標文件，比照上開說明三、(一)辦理，並依招標期限標準第7條第1項之規定，視需要延長等標期。</w:t>
       </w:r>
     </w:p>
     <w:p>
@@ -43830,37 +43340,7 @@
           <w:b w:val="0"/>
           <w:sz w:val="24"/>
         </w:rPr>
-        <w:t>２、已截止投標尚未開(決)標之採購案件，續行決標後辦理契約變更，與廠商合意比照說明</w:t>
-      </w:r>
-    </w:p>
-    <w:p>
-      <w:pPr>
-        <w:pStyle w:val="a9"/>
-        <w:ind w:left="720" w:hanging="480"/>
-        <w:jc w:val="both"/>
-      </w:pPr>
-      <w:r>
-        <w:rPr>
-          <w:rFonts w:ascii="新細明體" w:hAnsi="新細明體" w:eastAsia="新細明體"/>
-          <w:b w:val="0"/>
-          <w:sz w:val="24"/>
-        </w:rPr>
-        <w:t>三、(三)辦理；或依政府採購法(下稱採購法)第48條第1項第1款不予開(決)標，比照說明</w:t>
-      </w:r>
-    </w:p>
-    <w:p>
-      <w:pPr>
-        <w:pStyle w:val="a9"/>
-        <w:ind w:left="720" w:hanging="480"/>
-        <w:jc w:val="both"/>
-      </w:pPr>
-      <w:r>
-        <w:rPr>
-          <w:rFonts w:ascii="新細明體" w:hAnsi="新細明體" w:eastAsia="新細明體"/>
-          <w:b w:val="0"/>
-          <w:sz w:val="24"/>
-        </w:rPr>
-        <w:t>三、(一)修正招標文件後重行招標。</w:t>
+        <w:t>２、已截止投標尚未開(決)標之採購案件，續行決標後辦理契約變更，與廠商合意比照說明三、(三)辦理；或依政府採購法(下稱採購法)第48條第1項第1款不予開(決)標，比照說明三、(一)修正招標文件後重行招標。</w:t>
       </w:r>
     </w:p>
     <w:p>
@@ -43890,22 +43370,7 @@
           <w:b w:val="0"/>
           <w:sz w:val="24"/>
         </w:rPr>
-        <w:t>１、依契約變更條款約定辦理契約變更，與廠商合意比照說明</w:t>
-      </w:r>
-    </w:p>
-    <w:p>
-      <w:pPr>
-        <w:pStyle w:val="a9"/>
-        <w:ind w:left="720" w:hanging="480"/>
-        <w:jc w:val="both"/>
-      </w:pPr>
-      <w:r>
-        <w:rPr>
-          <w:rFonts w:ascii="新細明體" w:hAnsi="新細明體" w:eastAsia="新細明體"/>
-          <w:b w:val="0"/>
-          <w:sz w:val="24"/>
-        </w:rPr>
-        <w:t>三、(一)辦理。</w:t>
+        <w:t>１、依契約變更條款約定辦理契約變更，與廠商合意比照說明三、(一)辦理。</w:t>
       </w:r>
     </w:p>
     <w:p>

</xml_diff>

<commit_message>
Complete Chapter 2 data matching, create extract_chapter2.py script, and generate 第二章.json
</commit_message>
<xml_diff>
--- a/第一章/第一章.docx
+++ b/第一章/第一章.docx
@@ -109,7 +109,21 @@
           <w:rFonts w:ascii="新細明體" w:eastAsia="新細明體" w:hAnsi="新細明體"/>
           <w:lang w:eastAsia="zh-TW"/>
         </w:rPr>
-        <w:t>說明：復貴局八十七年十月廿三日八十七林範字第三Ｏ九六號函。</w:t>
+        <w:t>說明：復貴局八十七年十月廿三日八十七林範字第三</w:t>
+      </w:r>
+      <w:r>
+        <w:rPr>
+          <w:rFonts w:ascii="新細明體" w:eastAsia="新細明體" w:hAnsi="新細明體"/>
+          <w:lang w:eastAsia="zh-TW"/>
+        </w:rPr>
+        <w:t>〇</w:t>
+      </w:r>
+      <w:r>
+        <w:rPr>
+          <w:rFonts w:ascii="新細明體" w:eastAsia="新細明體" w:hAnsi="新細明體"/>
+          <w:lang w:eastAsia="zh-TW"/>
+        </w:rPr>
+        <w:t>九六號函。</w:t>
       </w:r>
     </w:p>
     <w:p>
@@ -303,7 +317,21 @@
           <w:rFonts w:ascii="新細明體" w:eastAsia="新細明體" w:hAnsi="新細明體"/>
           <w:lang w:eastAsia="zh-TW"/>
         </w:rPr>
-        <w:t>一、復貴局八十八年六月二十三日八十八職檢字第Ｏ一一七九五號函。</w:t>
+        <w:t>一、復貴局八十八年六月二十三日八十八職檢字第</w:t>
+      </w:r>
+      <w:r>
+        <w:rPr>
+          <w:rFonts w:ascii="新細明體" w:eastAsia="新細明體" w:hAnsi="新細明體"/>
+          <w:lang w:eastAsia="zh-TW"/>
+        </w:rPr>
+        <w:t>〇</w:t>
+      </w:r>
+      <w:r>
+        <w:rPr>
+          <w:rFonts w:ascii="新細明體" w:eastAsia="新細明體" w:hAnsi="新細明體"/>
+          <w:lang w:eastAsia="zh-TW"/>
+        </w:rPr>
+        <w:t>一一七九五號函。</w:t>
       </w:r>
     </w:p>
     <w:p>
@@ -575,7 +603,21 @@
           <w:rFonts w:ascii="新細明體" w:eastAsia="新細明體" w:hAnsi="新細明體"/>
           <w:lang w:eastAsia="zh-TW"/>
         </w:rPr>
-        <w:t>一、復貴局八十八年六月八日工(八八)五字第Ｏ二二八七八號函。</w:t>
+        <w:t>一、復貴局八十八年六月八日工(八八)五字第</w:t>
+      </w:r>
+      <w:r>
+        <w:rPr>
+          <w:rFonts w:ascii="新細明體" w:eastAsia="新細明體" w:hAnsi="新細明體"/>
+          <w:lang w:eastAsia="zh-TW"/>
+        </w:rPr>
+        <w:t>〇</w:t>
+      </w:r>
+      <w:r>
+        <w:rPr>
+          <w:rFonts w:ascii="新細明體" w:eastAsia="新細明體" w:hAnsi="新細明體"/>
+          <w:lang w:eastAsia="zh-TW"/>
+        </w:rPr>
+        <w:t>二二八七八號函。</w:t>
       </w:r>
     </w:p>
     <w:p>
@@ -626,7 +668,49 @@
           <w:rFonts w:ascii="新細明體" w:eastAsia="新細明體" w:hAnsi="新細明體"/>
           <w:lang w:eastAsia="zh-TW"/>
         </w:rPr>
-        <w:t>備註：1. 依九十一年二月六日總統華總一義字第Ｏ九一ＯＯＯ二五六一Ｏ號令修正公布之政府採購法第二十二條第一項規定，符合該條第一項各款情形之採購，得採限制性招標，免報經上級機關核准。</w:t>
+        <w:t>備註：1. 依九十一年二月六日總統華總一義字第</w:t>
+      </w:r>
+      <w:r>
+        <w:rPr>
+          <w:rFonts w:ascii="新細明體" w:eastAsia="新細明體" w:hAnsi="新細明體"/>
+          <w:lang w:eastAsia="zh-TW"/>
+        </w:rPr>
+        <w:t>〇</w:t>
+      </w:r>
+      <w:r>
+        <w:rPr>
+          <w:rFonts w:ascii="新細明體" w:eastAsia="新細明體" w:hAnsi="新細明體"/>
+          <w:lang w:eastAsia="zh-TW"/>
+        </w:rPr>
+        <w:t>九一</w:t>
+      </w:r>
+      <w:r>
+        <w:rPr>
+          <w:rFonts w:ascii="新細明體" w:eastAsia="新細明體" w:hAnsi="新細明體"/>
+          <w:lang w:eastAsia="zh-TW"/>
+        </w:rPr>
+        <w:t>〇〇〇</w:t>
+      </w:r>
+      <w:r>
+        <w:rPr>
+          <w:rFonts w:ascii="新細明體" w:eastAsia="新細明體" w:hAnsi="新細明體"/>
+          <w:lang w:eastAsia="zh-TW"/>
+        </w:rPr>
+        <w:t>二五六一</w:t>
+      </w:r>
+      <w:r>
+        <w:rPr>
+          <w:rFonts w:ascii="新細明體" w:eastAsia="新細明體" w:hAnsi="新細明體"/>
+          <w:lang w:eastAsia="zh-TW"/>
+        </w:rPr>
+        <w:t>〇</w:t>
+      </w:r>
+      <w:r>
+        <w:rPr>
+          <w:rFonts w:ascii="新細明體" w:eastAsia="新細明體" w:hAnsi="新細明體"/>
+          <w:lang w:eastAsia="zh-TW"/>
+        </w:rPr>
+        <w:t>號令修正公布之政府採購法第二十二條第一項規定，符合該條第一項各款情形之採購，得採限制性招標，免報經上級機關核准。</w:t>
       </w:r>
     </w:p>
     <w:p>
@@ -702,7 +786,21 @@
           <w:rFonts w:ascii="新細明體" w:eastAsia="新細明體" w:hAnsi="新細明體"/>
           <w:lang w:eastAsia="zh-TW"/>
         </w:rPr>
-        <w:t>一、復貴局八十八年六月二十四日台八十八職公字第Ｏ一一一四七號函。</w:t>
+        <w:t>一、復貴局八十八年六月二十四日台八十八職公字第</w:t>
+      </w:r>
+      <w:r>
+        <w:rPr>
+          <w:rFonts w:ascii="新細明體" w:eastAsia="新細明體" w:hAnsi="新細明體"/>
+          <w:lang w:eastAsia="zh-TW"/>
+        </w:rPr>
+        <w:t>〇</w:t>
+      </w:r>
+      <w:r>
+        <w:rPr>
+          <w:rFonts w:ascii="新細明體" w:eastAsia="新細明體" w:hAnsi="新細明體"/>
+          <w:lang w:eastAsia="zh-TW"/>
+        </w:rPr>
+        <w:t>一一一四七號函。</w:t>
       </w:r>
     </w:p>
     <w:p>
@@ -1006,7 +1104,21 @@
           <w:rFonts w:ascii="新細明體" w:eastAsia="新細明體" w:hAnsi="新細明體"/>
           <w:lang w:eastAsia="zh-TW"/>
         </w:rPr>
-        <w:t>說明：復貴局八十八年八月十七日八八公財字第二一三四Ｏ號函。</w:t>
+        <w:t>說明：復貴局八十八年八月十七日八八公財字第二一三四</w:t>
+      </w:r>
+      <w:r>
+        <w:rPr>
+          <w:rFonts w:ascii="新細明體" w:eastAsia="新細明體" w:hAnsi="新細明體"/>
+          <w:lang w:eastAsia="zh-TW"/>
+        </w:rPr>
+        <w:t>〇</w:t>
+      </w:r>
+      <w:r>
+        <w:rPr>
+          <w:rFonts w:ascii="新細明體" w:eastAsia="新細明體" w:hAnsi="新細明體"/>
+          <w:lang w:eastAsia="zh-TW"/>
+        </w:rPr>
+        <w:t>號函。</w:t>
       </w:r>
     </w:p>
     <w:p>
@@ -1429,7 +1541,21 @@
           <w:rFonts w:ascii="新細明體" w:eastAsia="新細明體" w:hAnsi="新細明體"/>
           <w:lang w:eastAsia="zh-TW"/>
         </w:rPr>
-        <w:t>一、復貴局八十九年一月五日(八九)童托字第八九０００六三號函。</w:t>
+        <w:t>一、復貴局八十九年一月五日(八九)童托字第八九</w:t>
+      </w:r>
+      <w:r>
+        <w:rPr>
+          <w:rFonts w:ascii="新細明體" w:eastAsia="新細明體" w:hAnsi="新細明體"/>
+          <w:lang w:eastAsia="zh-TW"/>
+        </w:rPr>
+        <w:t>〇〇〇</w:t>
+      </w:r>
+      <w:r>
+        <w:rPr>
+          <w:rFonts w:ascii="新細明體" w:eastAsia="新細明體" w:hAnsi="新細明體"/>
+          <w:lang w:eastAsia="zh-TW"/>
+        </w:rPr>
+        <w:t>六三號函。</w:t>
       </w:r>
     </w:p>
     <w:p>
@@ -1835,7 +1961,21 @@
           <w:rFonts w:ascii="新細明體" w:eastAsia="新細明體" w:hAnsi="新細明體"/>
           <w:lang w:eastAsia="zh-TW"/>
         </w:rPr>
-        <w:t>說明：復貴府八十九年五月五日八九彰府工發字第０八四五五九號函。</w:t>
+        <w:t>說明：復貴府八十九年五月五日八九彰府工發字第</w:t>
+      </w:r>
+      <w:r>
+        <w:rPr>
+          <w:rFonts w:ascii="新細明體" w:eastAsia="新細明體" w:hAnsi="新細明體"/>
+          <w:lang w:eastAsia="zh-TW"/>
+        </w:rPr>
+        <w:t>〇</w:t>
+      </w:r>
+      <w:r>
+        <w:rPr>
+          <w:rFonts w:ascii="新細明體" w:eastAsia="新細明體" w:hAnsi="新細明體"/>
+          <w:lang w:eastAsia="zh-TW"/>
+        </w:rPr>
+        <w:t>八四五五九號函。</w:t>
       </w:r>
     </w:p>
     <w:p>
@@ -2207,41 +2347,97 @@
           <w:rFonts w:ascii="新細明體" w:eastAsia="新細明體" w:hAnsi="新細明體"/>
           <w:lang w:eastAsia="zh-TW"/>
         </w:rPr>
-        <w:t>一、復貴公司九十年六月五日（九十）油工九００六００七七號函。</w:t>
-      </w:r>
-    </w:p>
-    <w:p>
-      <w:pPr>
-        <w:pStyle w:val="a9"/>
-        <w:ind w:hanging="480"/>
-        <w:jc w:val="both"/>
-        <w:rPr>
-          <w:lang w:eastAsia="zh-TW"/>
-        </w:rPr>
-      </w:pPr>
-      <w:r>
-        <w:rPr>
-          <w:rFonts w:ascii="新細明體" w:eastAsia="新細明體" w:hAnsi="新細明體"/>
-          <w:lang w:eastAsia="zh-TW"/>
-        </w:rPr>
-        <w:t>二、旨揭委託案係貴公司依都市計畫法第二十四條規定將土地利用之規劃及變更計畫之擬定作業委託辦理，因該擬定作業非都市計畫法所定新竹市政府之法定職權，應屬勞務委託，故委託對象之擇定，自應適用政府採購法。本會並已以八十九年十一月十日（八九）工程企字第八九０三二四六九號函復經濟部國營事業委員會在案。</w:t>
-      </w:r>
-    </w:p>
-    <w:p>
-      <w:pPr>
-        <w:pStyle w:val="a9"/>
-        <w:ind w:hanging="480"/>
-        <w:jc w:val="both"/>
-        <w:rPr>
-          <w:lang w:eastAsia="zh-TW"/>
-        </w:rPr>
-      </w:pPr>
-      <w:r>
-        <w:rPr>
-          <w:rFonts w:ascii="新細明體" w:eastAsia="新細明體" w:hAnsi="新細明體"/>
-          <w:lang w:eastAsia="zh-TW"/>
-        </w:rPr>
-        <w:t>三、本會八十八年七月二十日（八八）工程企字第八八０八五二三號函（答覆臺灣鐵路管理局函）自即日起停止適用。</w:t>
+        <w:t>一、復貴公司九十年六月五日（九十）油工九</w:t>
+      </w:r>
+      <w:r>
+        <w:rPr>
+          <w:rFonts w:ascii="新細明體" w:eastAsia="新細明體" w:hAnsi="新細明體"/>
+          <w:lang w:eastAsia="zh-TW"/>
+        </w:rPr>
+        <w:t>〇〇</w:t>
+      </w:r>
+      <w:r>
+        <w:rPr>
+          <w:rFonts w:ascii="新細明體" w:eastAsia="新細明體" w:hAnsi="新細明體"/>
+          <w:lang w:eastAsia="zh-TW"/>
+        </w:rPr>
+        <w:t>六</w:t>
+      </w:r>
+      <w:r>
+        <w:rPr>
+          <w:rFonts w:ascii="新細明體" w:eastAsia="新細明體" w:hAnsi="新細明體"/>
+          <w:lang w:eastAsia="zh-TW"/>
+        </w:rPr>
+        <w:t>〇〇</w:t>
+      </w:r>
+      <w:r>
+        <w:rPr>
+          <w:rFonts w:ascii="新細明體" w:eastAsia="新細明體" w:hAnsi="新細明體"/>
+          <w:lang w:eastAsia="zh-TW"/>
+        </w:rPr>
+        <w:t>七七號函。</w:t>
+      </w:r>
+    </w:p>
+    <w:p>
+      <w:pPr>
+        <w:pStyle w:val="a9"/>
+        <w:ind w:hanging="480"/>
+        <w:jc w:val="both"/>
+        <w:rPr>
+          <w:lang w:eastAsia="zh-TW"/>
+        </w:rPr>
+      </w:pPr>
+      <w:r>
+        <w:rPr>
+          <w:rFonts w:ascii="新細明體" w:eastAsia="新細明體" w:hAnsi="新細明體"/>
+          <w:lang w:eastAsia="zh-TW"/>
+        </w:rPr>
+        <w:t>二、旨揭委託案係貴公司依都市計畫法第二十四條規定將土地利用之規劃及變更計畫之擬定作業委託辦理，因該擬定作業非都市計畫法所定新竹市政府之法定職權，應屬勞務委託，故委託對象之擇定，自應適用政府採購法。本會並已以八十九年十一月十日（八九）工程企字第八九</w:t>
+      </w:r>
+      <w:r>
+        <w:rPr>
+          <w:rFonts w:ascii="新細明體" w:eastAsia="新細明體" w:hAnsi="新細明體"/>
+          <w:lang w:eastAsia="zh-TW"/>
+        </w:rPr>
+        <w:t>〇</w:t>
+      </w:r>
+      <w:r>
+        <w:rPr>
+          <w:rFonts w:ascii="新細明體" w:eastAsia="新細明體" w:hAnsi="新細明體"/>
+          <w:lang w:eastAsia="zh-TW"/>
+        </w:rPr>
+        <w:t>三二四六九號函復經濟部國營事業委員會在案。</w:t>
+      </w:r>
+    </w:p>
+    <w:p>
+      <w:pPr>
+        <w:pStyle w:val="a9"/>
+        <w:ind w:hanging="480"/>
+        <w:jc w:val="both"/>
+        <w:rPr>
+          <w:lang w:eastAsia="zh-TW"/>
+        </w:rPr>
+      </w:pPr>
+      <w:r>
+        <w:rPr>
+          <w:rFonts w:ascii="新細明體" w:eastAsia="新細明體" w:hAnsi="新細明體"/>
+          <w:lang w:eastAsia="zh-TW"/>
+        </w:rPr>
+        <w:t>三、本會八十八年七月二十日（八八）工程企字第八八</w:t>
+      </w:r>
+      <w:r>
+        <w:rPr>
+          <w:rFonts w:ascii="新細明體" w:eastAsia="新細明體" w:hAnsi="新細明體"/>
+          <w:lang w:eastAsia="zh-TW"/>
+        </w:rPr>
+        <w:t>〇</w:t>
+      </w:r>
+      <w:r>
+        <w:rPr>
+          <w:rFonts w:ascii="新細明體" w:eastAsia="新細明體" w:hAnsi="新細明體"/>
+          <w:lang w:eastAsia="zh-TW"/>
+        </w:rPr>
+        <w:t>八五二三號函（答覆臺灣鐵路管理局函）自即日起停止適用。</w:t>
       </w:r>
     </w:p>
     <w:p>
@@ -7754,7 +7950,21 @@
           <w:rFonts w:ascii="新細明體" w:eastAsia="新細明體" w:hAnsi="新細明體"/>
           <w:lang w:eastAsia="zh-TW"/>
         </w:rPr>
-        <w:t>說明：復貴局八十八年八月三日北市環總字第八八二二八九三九ＯＯ號函。</w:t>
+        <w:t>說明：復貴局八十八年八月三日北市環總字第八八二二八九三九</w:t>
+      </w:r>
+      <w:r>
+        <w:rPr>
+          <w:rFonts w:ascii="新細明體" w:eastAsia="新細明體" w:hAnsi="新細明體"/>
+          <w:lang w:eastAsia="zh-TW"/>
+        </w:rPr>
+        <w:t>〇〇</w:t>
+      </w:r>
+      <w:r>
+        <w:rPr>
+          <w:rFonts w:ascii="新細明體" w:eastAsia="新細明體" w:hAnsi="新細明體"/>
+          <w:lang w:eastAsia="zh-TW"/>
+        </w:rPr>
+        <w:t>號函。</w:t>
       </w:r>
     </w:p>
     <w:p>
@@ -7889,24 +8099,80 @@
           <w:rFonts w:ascii="新細明體" w:eastAsia="新細明體" w:hAnsi="新細明體"/>
           <w:lang w:eastAsia="zh-TW"/>
         </w:rPr>
-        <w:t>一、復貴會八十八年八月十七日﹙八八﹚農企字第八八Ｏ一Ｏ二二四號函。</w:t>
-      </w:r>
-    </w:p>
-    <w:p>
-      <w:pPr>
-        <w:pStyle w:val="a9"/>
-        <w:ind w:hanging="480"/>
-        <w:jc w:val="both"/>
-        <w:rPr>
-          <w:lang w:eastAsia="zh-TW"/>
-        </w:rPr>
-      </w:pPr>
-      <w:r>
-        <w:rPr>
-          <w:rFonts w:ascii="新細明體" w:eastAsia="新細明體" w:hAnsi="新細明體"/>
-          <w:lang w:eastAsia="zh-TW"/>
-        </w:rPr>
-        <w:t>二、依「台灣省政府功能業務與組織調整暫行條例」第二條規定，台灣省政府﹙以下簡稱省政府﹚為行政院派出機關辦理行政院交辦事項。行政院八十八年七月八日台八十七研綜字第Ｏ三四Ｏ九號函所列中央委託省政府辦理事項，應屬行政院交辦事項，首揭計畫如屬上揭院函所列事項，貴會得逕行委託省政府辦理，不適用政府採購法。</w:t>
+        <w:t>一、復貴會八十八年八月十七日﹙八八﹚農企字第八八</w:t>
+      </w:r>
+      <w:r>
+        <w:rPr>
+          <w:rFonts w:ascii="新細明體" w:eastAsia="新細明體" w:hAnsi="新細明體"/>
+          <w:lang w:eastAsia="zh-TW"/>
+        </w:rPr>
+        <w:t>〇</w:t>
+      </w:r>
+      <w:r>
+        <w:rPr>
+          <w:rFonts w:ascii="新細明體" w:eastAsia="新細明體" w:hAnsi="新細明體"/>
+          <w:lang w:eastAsia="zh-TW"/>
+        </w:rPr>
+        <w:t>一</w:t>
+      </w:r>
+      <w:r>
+        <w:rPr>
+          <w:rFonts w:ascii="新細明體" w:eastAsia="新細明體" w:hAnsi="新細明體"/>
+          <w:lang w:eastAsia="zh-TW"/>
+        </w:rPr>
+        <w:t>〇</w:t>
+      </w:r>
+      <w:r>
+        <w:rPr>
+          <w:rFonts w:ascii="新細明體" w:eastAsia="新細明體" w:hAnsi="新細明體"/>
+          <w:lang w:eastAsia="zh-TW"/>
+        </w:rPr>
+        <w:t>二二四號函。</w:t>
+      </w:r>
+    </w:p>
+    <w:p>
+      <w:pPr>
+        <w:pStyle w:val="a9"/>
+        <w:ind w:hanging="480"/>
+        <w:jc w:val="both"/>
+        <w:rPr>
+          <w:lang w:eastAsia="zh-TW"/>
+        </w:rPr>
+      </w:pPr>
+      <w:r>
+        <w:rPr>
+          <w:rFonts w:ascii="新細明體" w:eastAsia="新細明體" w:hAnsi="新細明體"/>
+          <w:lang w:eastAsia="zh-TW"/>
+        </w:rPr>
+        <w:t>二、依「台灣省政府功能業務與組織調整暫行條例」第二條規定，台灣省政府﹙以下簡稱省政府﹚為行政院派出機關辦理行政院交辦事項。行政院八十八年七月八日台八十七研綜字第</w:t>
+      </w:r>
+      <w:r>
+        <w:rPr>
+          <w:rFonts w:ascii="新細明體" w:eastAsia="新細明體" w:hAnsi="新細明體"/>
+          <w:lang w:eastAsia="zh-TW"/>
+        </w:rPr>
+        <w:t>〇</w:t>
+      </w:r>
+      <w:r>
+        <w:rPr>
+          <w:rFonts w:ascii="新細明體" w:eastAsia="新細明體" w:hAnsi="新細明體"/>
+          <w:lang w:eastAsia="zh-TW"/>
+        </w:rPr>
+        <w:t>三四</w:t>
+      </w:r>
+      <w:r>
+        <w:rPr>
+          <w:rFonts w:ascii="新細明體" w:eastAsia="新細明體" w:hAnsi="新細明體"/>
+          <w:lang w:eastAsia="zh-TW"/>
+        </w:rPr>
+        <w:t>〇</w:t>
+      </w:r>
+      <w:r>
+        <w:rPr>
+          <w:rFonts w:ascii="新細明體" w:eastAsia="新細明體" w:hAnsi="新細明體"/>
+          <w:lang w:eastAsia="zh-TW"/>
+        </w:rPr>
+        <w:t>九號函所列中央委託省政府辦理事項，應屬行政院交辦事項，首揭計畫如屬上揭院函所列事項，貴會得逕行委託省政府辦理，不適用政府採購法。</w:t>
       </w:r>
     </w:p>
     <w:p>
@@ -7982,7 +8248,63 @@
           <w:rFonts w:ascii="新細明體" w:eastAsia="新細明體" w:hAnsi="新細明體"/>
           <w:lang w:eastAsia="zh-TW"/>
         </w:rPr>
-        <w:t>一、復貴局八十八年六月二日八十八職檢字第Ｏ一Ｏ二六四號暨七月十四日八十八職檢字第Ｏ一三八Ｏ七號二函。</w:t>
+        <w:t>一、復貴局八十八年六月二日八十八職檢字第</w:t>
+      </w:r>
+      <w:r>
+        <w:rPr>
+          <w:rFonts w:ascii="新細明體" w:eastAsia="新細明體" w:hAnsi="新細明體"/>
+          <w:lang w:eastAsia="zh-TW"/>
+        </w:rPr>
+        <w:t>〇</w:t>
+      </w:r>
+      <w:r>
+        <w:rPr>
+          <w:rFonts w:ascii="新細明體" w:eastAsia="新細明體" w:hAnsi="新細明體"/>
+          <w:lang w:eastAsia="zh-TW"/>
+        </w:rPr>
+        <w:t>一</w:t>
+      </w:r>
+      <w:r>
+        <w:rPr>
+          <w:rFonts w:ascii="新細明體" w:eastAsia="新細明體" w:hAnsi="新細明體"/>
+          <w:lang w:eastAsia="zh-TW"/>
+        </w:rPr>
+        <w:t>〇</w:t>
+      </w:r>
+      <w:r>
+        <w:rPr>
+          <w:rFonts w:ascii="新細明體" w:eastAsia="新細明體" w:hAnsi="新細明體"/>
+          <w:lang w:eastAsia="zh-TW"/>
+        </w:rPr>
+        <w:t>二六四號暨七月十四日八十八職檢字第</w:t>
+      </w:r>
+      <w:r>
+        <w:rPr>
+          <w:rFonts w:ascii="新細明體" w:eastAsia="新細明體" w:hAnsi="新細明體"/>
+          <w:lang w:eastAsia="zh-TW"/>
+        </w:rPr>
+        <w:t>〇</w:t>
+      </w:r>
+      <w:r>
+        <w:rPr>
+          <w:rFonts w:ascii="新細明體" w:eastAsia="新細明體" w:hAnsi="新細明體"/>
+          <w:lang w:eastAsia="zh-TW"/>
+        </w:rPr>
+        <w:t>一三八</w:t>
+      </w:r>
+      <w:r>
+        <w:rPr>
+          <w:rFonts w:ascii="新細明體" w:eastAsia="新細明體" w:hAnsi="新細明體"/>
+          <w:lang w:eastAsia="zh-TW"/>
+        </w:rPr>
+        <w:t>〇</w:t>
+      </w:r>
+      <w:r>
+        <w:rPr>
+          <w:rFonts w:ascii="新細明體" w:eastAsia="新細明體" w:hAnsi="新細明體"/>
+          <w:lang w:eastAsia="zh-TW"/>
+        </w:rPr>
+        <w:t>七號二函。</w:t>
       </w:r>
     </w:p>
     <w:p>
@@ -8058,7 +8380,21 @@
           <w:rFonts w:ascii="新細明體" w:eastAsia="新細明體" w:hAnsi="新細明體"/>
           <w:lang w:eastAsia="zh-TW"/>
         </w:rPr>
-        <w:t>說明：復貴公司八十八年九月十五日北捷捷財字第八八二一四二一八ＯＯ號函。</w:t>
+        <w:t>說明：復貴公司八十八年九月十五日北捷捷財字第八八二一四二一八</w:t>
+      </w:r>
+      <w:r>
+        <w:rPr>
+          <w:rFonts w:ascii="新細明體" w:eastAsia="新細明體" w:hAnsi="新細明體"/>
+          <w:lang w:eastAsia="zh-TW"/>
+        </w:rPr>
+        <w:t>〇〇</w:t>
+      </w:r>
+      <w:r>
+        <w:rPr>
+          <w:rFonts w:ascii="新細明體" w:eastAsia="新細明體" w:hAnsi="新細明體"/>
+          <w:lang w:eastAsia="zh-TW"/>
+        </w:rPr>
+        <w:t>號函。</w:t>
       </w:r>
     </w:p>
     <w:p>
@@ -10435,7 +10771,21 @@
           <w:rFonts w:ascii="新細明體" w:eastAsia="新細明體" w:hAnsi="新細明體"/>
           <w:lang w:eastAsia="zh-TW"/>
         </w:rPr>
-        <w:t>說明：復貴局八十八年六月二十四日貿（八八）二發字第Ｏ七三三一號函。</w:t>
+        <w:t>說明：復貴局八十八年六月二十四日貿（八八）二發字第</w:t>
+      </w:r>
+      <w:r>
+        <w:rPr>
+          <w:rFonts w:ascii="新細明體" w:eastAsia="新細明體" w:hAnsi="新細明體"/>
+          <w:lang w:eastAsia="zh-TW"/>
+        </w:rPr>
+        <w:t>〇</w:t>
+      </w:r>
+      <w:r>
+        <w:rPr>
+          <w:rFonts w:ascii="新細明體" w:eastAsia="新細明體" w:hAnsi="新細明體"/>
+          <w:lang w:eastAsia="zh-TW"/>
+        </w:rPr>
+        <w:t>七三三一號函。</w:t>
       </w:r>
     </w:p>
     <w:p>
@@ -10705,7 +11055,35 @@
           <w:rFonts w:ascii="新細明體" w:eastAsia="新細明體" w:hAnsi="新細明體"/>
           <w:lang w:eastAsia="zh-TW"/>
         </w:rPr>
-        <w:t>說明：復貴局八十八年八月十八日北市捷五字第八八二一九Ｏ四六ＯＯ號函。</w:t>
+        <w:t>說明：復貴局八十八年八月十八日北市捷五字第八八二一九</w:t>
+      </w:r>
+      <w:r>
+        <w:rPr>
+          <w:rFonts w:ascii="新細明體" w:eastAsia="新細明體" w:hAnsi="新細明體"/>
+          <w:lang w:eastAsia="zh-TW"/>
+        </w:rPr>
+        <w:t>〇</w:t>
+      </w:r>
+      <w:r>
+        <w:rPr>
+          <w:rFonts w:ascii="新細明體" w:eastAsia="新細明體" w:hAnsi="新細明體"/>
+          <w:lang w:eastAsia="zh-TW"/>
+        </w:rPr>
+        <w:t>四六</w:t>
+      </w:r>
+      <w:r>
+        <w:rPr>
+          <w:rFonts w:ascii="新細明體" w:eastAsia="新細明體" w:hAnsi="新細明體"/>
+          <w:lang w:eastAsia="zh-TW"/>
+        </w:rPr>
+        <w:t>〇〇</w:t>
+      </w:r>
+      <w:r>
+        <w:rPr>
+          <w:rFonts w:ascii="新細明體" w:eastAsia="新細明體" w:hAnsi="新細明體"/>
+          <w:lang w:eastAsia="zh-TW"/>
+        </w:rPr>
+        <w:t>號函。</w:t>
       </w:r>
     </w:p>
     <w:p>
@@ -10840,7 +11218,49 @@
           <w:rFonts w:ascii="新細明體" w:eastAsia="新細明體" w:hAnsi="新細明體"/>
           <w:lang w:eastAsia="zh-TW"/>
         </w:rPr>
-        <w:t>一、復貴部八十八年九月三日交航八十八字第Ｏ四Ｏ七Ｏ二號函。</w:t>
+        <w:t>一、復貴部八十八年九月三日交航八十八字第</w:t>
+      </w:r>
+      <w:r>
+        <w:rPr>
+          <w:rFonts w:ascii="新細明體" w:eastAsia="新細明體" w:hAnsi="新細明體"/>
+          <w:lang w:eastAsia="zh-TW"/>
+        </w:rPr>
+        <w:t>〇</w:t>
+      </w:r>
+      <w:r>
+        <w:rPr>
+          <w:rFonts w:ascii="新細明體" w:eastAsia="新細明體" w:hAnsi="新細明體"/>
+          <w:lang w:eastAsia="zh-TW"/>
+        </w:rPr>
+        <w:t>四</w:t>
+      </w:r>
+      <w:r>
+        <w:rPr>
+          <w:rFonts w:ascii="新細明體" w:eastAsia="新細明體" w:hAnsi="新細明體"/>
+          <w:lang w:eastAsia="zh-TW"/>
+        </w:rPr>
+        <w:t>〇</w:t>
+      </w:r>
+      <w:r>
+        <w:rPr>
+          <w:rFonts w:ascii="新細明體" w:eastAsia="新細明體" w:hAnsi="新細明體"/>
+          <w:lang w:eastAsia="zh-TW"/>
+        </w:rPr>
+        <w:t>七</w:t>
+      </w:r>
+      <w:r>
+        <w:rPr>
+          <w:rFonts w:ascii="新細明體" w:eastAsia="新細明體" w:hAnsi="新細明體"/>
+          <w:lang w:eastAsia="zh-TW"/>
+        </w:rPr>
+        <w:t>〇</w:t>
+      </w:r>
+      <w:r>
+        <w:rPr>
+          <w:rFonts w:ascii="新細明體" w:eastAsia="新細明體" w:hAnsi="新細明體"/>
+          <w:lang w:eastAsia="zh-TW"/>
+        </w:rPr>
+        <w:t>二號函。</w:t>
       </w:r>
     </w:p>
     <w:p>
@@ -10916,7 +11336,35 @@
           <w:rFonts w:ascii="新細明體" w:eastAsia="新細明體" w:hAnsi="新細明體"/>
           <w:lang w:eastAsia="zh-TW"/>
         </w:rPr>
-        <w:t>說明：本會八十八年六月二十八日（八八）工程企字第八八〇八六八一號函及八十八年七月二十七日（八八）工程企字第八八一〇八一Ｏ號函停止適用，八十八年七月七日（八八）工程企字第八八〇九二Ｏ八號函及八十八年七月二十日（八八）工程企字第八八〇八四七三號函與首揭意旨不合部分，停止適用。</w:t>
+        <w:t>說明：本會八十八年六月二十八日（八八）工程企字第八八〇八六八一號函及八十八年七月二十七日（八八）工程企字第八八一〇八一</w:t>
+      </w:r>
+      <w:r>
+        <w:rPr>
+          <w:rFonts w:ascii="新細明體" w:eastAsia="新細明體" w:hAnsi="新細明體"/>
+          <w:lang w:eastAsia="zh-TW"/>
+        </w:rPr>
+        <w:t>〇</w:t>
+      </w:r>
+      <w:r>
+        <w:rPr>
+          <w:rFonts w:ascii="新細明體" w:eastAsia="新細明體" w:hAnsi="新細明體"/>
+          <w:lang w:eastAsia="zh-TW"/>
+        </w:rPr>
+        <w:t>號函停止適用，八十八年七月七日（八八）工程企字第八八〇九二</w:t>
+      </w:r>
+      <w:r>
+        <w:rPr>
+          <w:rFonts w:ascii="新細明體" w:eastAsia="新細明體" w:hAnsi="新細明體"/>
+          <w:lang w:eastAsia="zh-TW"/>
+        </w:rPr>
+        <w:t>〇</w:t>
+      </w:r>
+      <w:r>
+        <w:rPr>
+          <w:rFonts w:ascii="新細明體" w:eastAsia="新細明體" w:hAnsi="新細明體"/>
+          <w:lang w:eastAsia="zh-TW"/>
+        </w:rPr>
+        <w:t>八號函及八十八年七月二十日（八八）工程企字第八八〇八四七三號函與首揭意旨不合部分，停止適用。</w:t>
       </w:r>
     </w:p>
     <w:p>
@@ -11034,7 +11482,35 @@
           <w:rFonts w:ascii="新細明體" w:eastAsia="新細明體" w:hAnsi="新細明體"/>
           <w:lang w:eastAsia="zh-TW"/>
         </w:rPr>
-        <w:t>說明：本會八十八年八月三十一日 (八八)工程企字第八八一〇六三四號函答復貴部八十八年七月十六日台(八八)內社字第八八二五七九Ｏ號函及高雄市政府社會局八十八年七月二日高市社局秘字第一九Ｏ二六號所提「高雄市政府社會局暨所屬各機關對政府採購法意見彙整表」項次四、五、七、九、十等五項建議，諒達；另項次一、二、三、六、八等五項，答復如附件。</w:t>
+        <w:t>說明：本會八十八年八月三十一日 (八八)工程企字第八八一〇六三四號函答復貴部八十八年七月十六日台(八八)內社字第八八二五七九</w:t>
+      </w:r>
+      <w:r>
+        <w:rPr>
+          <w:rFonts w:ascii="新細明體" w:eastAsia="新細明體" w:hAnsi="新細明體"/>
+          <w:lang w:eastAsia="zh-TW"/>
+        </w:rPr>
+        <w:t>〇</w:t>
+      </w:r>
+      <w:r>
+        <w:rPr>
+          <w:rFonts w:ascii="新細明體" w:eastAsia="新細明體" w:hAnsi="新細明體"/>
+          <w:lang w:eastAsia="zh-TW"/>
+        </w:rPr>
+        <w:t>號函及高雄市政府社會局八十八年七月二日高市社局秘字第一九</w:t>
+      </w:r>
+      <w:r>
+        <w:rPr>
+          <w:rFonts w:ascii="新細明體" w:eastAsia="新細明體" w:hAnsi="新細明體"/>
+          <w:lang w:eastAsia="zh-TW"/>
+        </w:rPr>
+        <w:t>〇</w:t>
+      </w:r>
+      <w:r>
+        <w:rPr>
+          <w:rFonts w:ascii="新細明體" w:eastAsia="新細明體" w:hAnsi="新細明體"/>
+          <w:lang w:eastAsia="zh-TW"/>
+        </w:rPr>
+        <w:t>二六號所提「高雄市政府社會局暨所屬各機關對政府採購法意見彙整表」項次四、五、七、九、十等五項建議，諒達；另項次一、二、三、六、八等五項，答復如附件。</w:t>
       </w:r>
     </w:p>
     <w:p>
@@ -11051,7 +11527,49 @@
           <w:rFonts w:ascii="新細明體" w:eastAsia="新細明體" w:hAnsi="新細明體"/>
           <w:lang w:eastAsia="zh-TW"/>
         </w:rPr>
-        <w:t>備註：1. 依九十一年二月六日總統華總一義字第Ｏ九一ＯＯＯ二五六一Ｏ號令修正公布之政府採購法第二十二條第一項規定，符合該條第一項各款情形之採購，得採限制性招標，免報經上級機關核准。</w:t>
+        <w:t>備註：1. 依九十一年二月六日總統華總一義字第</w:t>
+      </w:r>
+      <w:r>
+        <w:rPr>
+          <w:rFonts w:ascii="新細明體" w:eastAsia="新細明體" w:hAnsi="新細明體"/>
+          <w:lang w:eastAsia="zh-TW"/>
+        </w:rPr>
+        <w:t>〇</w:t>
+      </w:r>
+      <w:r>
+        <w:rPr>
+          <w:rFonts w:ascii="新細明體" w:eastAsia="新細明體" w:hAnsi="新細明體"/>
+          <w:lang w:eastAsia="zh-TW"/>
+        </w:rPr>
+        <w:t>九一</w:t>
+      </w:r>
+      <w:r>
+        <w:rPr>
+          <w:rFonts w:ascii="新細明體" w:eastAsia="新細明體" w:hAnsi="新細明體"/>
+          <w:lang w:eastAsia="zh-TW"/>
+        </w:rPr>
+        <w:t>〇〇〇</w:t>
+      </w:r>
+      <w:r>
+        <w:rPr>
+          <w:rFonts w:ascii="新細明體" w:eastAsia="新細明體" w:hAnsi="新細明體"/>
+          <w:lang w:eastAsia="zh-TW"/>
+        </w:rPr>
+        <w:t>二五六一</w:t>
+      </w:r>
+      <w:r>
+        <w:rPr>
+          <w:rFonts w:ascii="新細明體" w:eastAsia="新細明體" w:hAnsi="新細明體"/>
+          <w:lang w:eastAsia="zh-TW"/>
+        </w:rPr>
+        <w:t>〇</w:t>
+      </w:r>
+      <w:r>
+        <w:rPr>
+          <w:rFonts w:ascii="新細明體" w:eastAsia="新細明體" w:hAnsi="新細明體"/>
+          <w:lang w:eastAsia="zh-TW"/>
+        </w:rPr>
+        <w:t>號令修正公布之政府採購法第二十二條第一項規定，符合該條第一項各款情形之採購，得採限制性招標，免報經上級機關核准。</w:t>
       </w:r>
     </w:p>
     <w:p>
@@ -11186,7 +11704,35 @@
           <w:rFonts w:ascii="新細明體" w:eastAsia="新細明體" w:hAnsi="新細明體"/>
           <w:lang w:eastAsia="zh-TW"/>
         </w:rPr>
-        <w:t>說明：復貴公司八十八年十月二十日電材字第八八一０ -一三０四號函。</w:t>
+        <w:t>說明：復貴公司八十八年十月二十日電材字第八八一</w:t>
+      </w:r>
+      <w:r>
+        <w:rPr>
+          <w:rFonts w:ascii="新細明體" w:eastAsia="新細明體" w:hAnsi="新細明體"/>
+          <w:lang w:eastAsia="zh-TW"/>
+        </w:rPr>
+        <w:t>〇</w:t>
+      </w:r>
+      <w:r>
+        <w:rPr>
+          <w:rFonts w:ascii="新細明體" w:eastAsia="新細明體" w:hAnsi="新細明體"/>
+          <w:lang w:eastAsia="zh-TW"/>
+        </w:rPr>
+        <w:t xml:space="preserve"> -一三</w:t>
+      </w:r>
+      <w:r>
+        <w:rPr>
+          <w:rFonts w:ascii="新細明體" w:eastAsia="新細明體" w:hAnsi="新細明體"/>
+          <w:lang w:eastAsia="zh-TW"/>
+        </w:rPr>
+        <w:t>〇</w:t>
+      </w:r>
+      <w:r>
+        <w:rPr>
+          <w:rFonts w:ascii="新細明體" w:eastAsia="新細明體" w:hAnsi="新細明體"/>
+          <w:lang w:eastAsia="zh-TW"/>
+        </w:rPr>
+        <w:t>四號函。</w:t>
       </w:r>
     </w:p>
     <w:p>
@@ -11439,7 +11985,21 @@
           <w:rFonts w:ascii="新細明體" w:eastAsia="新細明體" w:hAnsi="新細明體"/>
           <w:lang w:eastAsia="zh-TW"/>
         </w:rPr>
-        <w:t>一、復貴會八十九年六月二十六日八十九僑法字第０三二三七五號函。</w:t>
+        <w:t>一、復貴會八十九年六月二十六日八十九僑法字第</w:t>
+      </w:r>
+      <w:r>
+        <w:rPr>
+          <w:rFonts w:ascii="新細明體" w:eastAsia="新細明體" w:hAnsi="新細明體"/>
+          <w:lang w:eastAsia="zh-TW"/>
+        </w:rPr>
+        <w:t>〇</w:t>
+      </w:r>
+      <w:r>
+        <w:rPr>
+          <w:rFonts w:ascii="新細明體" w:eastAsia="新細明體" w:hAnsi="新細明體"/>
+          <w:lang w:eastAsia="zh-TW"/>
+        </w:rPr>
+        <w:t>三二三七五號函。</w:t>
       </w:r>
     </w:p>
     <w:p>
@@ -13343,7 +13903,35 @@
           <w:rFonts w:ascii="新細明體" w:eastAsia="新細明體" w:hAnsi="新細明體"/>
           <w:lang w:eastAsia="zh-TW"/>
         </w:rPr>
-        <w:t>一、復貴會八十八年七月八日八八文建秘字第Ｏ五二Ｏ八號函。</w:t>
+        <w:t>一、復貴會八十八年七月八日八八文建秘字第</w:t>
+      </w:r>
+      <w:r>
+        <w:rPr>
+          <w:rFonts w:ascii="新細明體" w:eastAsia="新細明體" w:hAnsi="新細明體"/>
+          <w:lang w:eastAsia="zh-TW"/>
+        </w:rPr>
+        <w:t>〇</w:t>
+      </w:r>
+      <w:r>
+        <w:rPr>
+          <w:rFonts w:ascii="新細明體" w:eastAsia="新細明體" w:hAnsi="新細明體"/>
+          <w:lang w:eastAsia="zh-TW"/>
+        </w:rPr>
+        <w:t>五二</w:t>
+      </w:r>
+      <w:r>
+        <w:rPr>
+          <w:rFonts w:ascii="新細明體" w:eastAsia="新細明體" w:hAnsi="新細明體"/>
+          <w:lang w:eastAsia="zh-TW"/>
+        </w:rPr>
+        <w:t>〇</w:t>
+      </w:r>
+      <w:r>
+        <w:rPr>
+          <w:rFonts w:ascii="新細明體" w:eastAsia="新細明體" w:hAnsi="新細明體"/>
+          <w:lang w:eastAsia="zh-TW"/>
+        </w:rPr>
+        <w:t>八號函。</w:t>
       </w:r>
     </w:p>
     <w:p>
@@ -13487,7 +14075,21 @@
           <w:rFonts w:ascii="新細明體" w:eastAsia="新細明體" w:hAnsi="新細明體"/>
           <w:lang w:eastAsia="zh-TW"/>
         </w:rPr>
-        <w:t>一、復貴公司八十八年七月三日﹙八八﹚船財字第四Ｏ七四號函。</w:t>
+        <w:t>一、復貴公司八十八年七月三日﹙八八﹚船財字第四</w:t>
+      </w:r>
+      <w:r>
+        <w:rPr>
+          <w:rFonts w:ascii="新細明體" w:eastAsia="新細明體" w:hAnsi="新細明體"/>
+          <w:lang w:eastAsia="zh-TW"/>
+        </w:rPr>
+        <w:t>〇</w:t>
+      </w:r>
+      <w:r>
+        <w:rPr>
+          <w:rFonts w:ascii="新細明體" w:eastAsia="新細明體" w:hAnsi="新細明體"/>
+          <w:lang w:eastAsia="zh-TW"/>
+        </w:rPr>
+        <w:t>七四號函。</w:t>
       </w:r>
     </w:p>
     <w:p>
@@ -14926,7 +15528,21 @@
           <w:rFonts w:ascii="新細明體" w:eastAsia="新細明體" w:hAnsi="新細明體"/>
           <w:lang w:eastAsia="zh-TW"/>
         </w:rPr>
-        <w:t>一、復貴署八十八年八月二十五日﹙八八﹚漁一字第八八六七ＯＯ三九號函。</w:t>
+        <w:t>一、復貴署八十八年八月二十五日﹙八八﹚漁一字第八八六七</w:t>
+      </w:r>
+      <w:r>
+        <w:rPr>
+          <w:rFonts w:ascii="新細明體" w:eastAsia="新細明體" w:hAnsi="新細明體"/>
+          <w:lang w:eastAsia="zh-TW"/>
+        </w:rPr>
+        <w:t>〇〇</w:t>
+      </w:r>
+      <w:r>
+        <w:rPr>
+          <w:rFonts w:ascii="新細明體" w:eastAsia="新細明體" w:hAnsi="新細明體"/>
+          <w:lang w:eastAsia="zh-TW"/>
+        </w:rPr>
+        <w:t>三九號函。</w:t>
       </w:r>
     </w:p>
     <w:p>
@@ -14977,7 +15593,49 @@
           <w:rFonts w:ascii="新細明體" w:eastAsia="新細明體" w:hAnsi="新細明體"/>
           <w:lang w:eastAsia="zh-TW"/>
         </w:rPr>
-        <w:t>備註：1. 依九十一年二月六日總統華總一義字第Ｏ九一ＯＯＯ二五六一Ｏ號令修正公布之政府採購法第二十二條第一項規定，符合該條第一項各款情形之採購，得採限制性招標，免報經上級機關核准。說明二第十三款為現行條文第十六款。</w:t>
+        <w:t>備註：1. 依九十一年二月六日總統華總一義字第</w:t>
+      </w:r>
+      <w:r>
+        <w:rPr>
+          <w:rFonts w:ascii="新細明體" w:eastAsia="新細明體" w:hAnsi="新細明體"/>
+          <w:lang w:eastAsia="zh-TW"/>
+        </w:rPr>
+        <w:t>〇</w:t>
+      </w:r>
+      <w:r>
+        <w:rPr>
+          <w:rFonts w:ascii="新細明體" w:eastAsia="新細明體" w:hAnsi="新細明體"/>
+          <w:lang w:eastAsia="zh-TW"/>
+        </w:rPr>
+        <w:t>九一</w:t>
+      </w:r>
+      <w:r>
+        <w:rPr>
+          <w:rFonts w:ascii="新細明體" w:eastAsia="新細明體" w:hAnsi="新細明體"/>
+          <w:lang w:eastAsia="zh-TW"/>
+        </w:rPr>
+        <w:t>〇〇〇</w:t>
+      </w:r>
+      <w:r>
+        <w:rPr>
+          <w:rFonts w:ascii="新細明體" w:eastAsia="新細明體" w:hAnsi="新細明體"/>
+          <w:lang w:eastAsia="zh-TW"/>
+        </w:rPr>
+        <w:t>二五六一</w:t>
+      </w:r>
+      <w:r>
+        <w:rPr>
+          <w:rFonts w:ascii="新細明體" w:eastAsia="新細明體" w:hAnsi="新細明體"/>
+          <w:lang w:eastAsia="zh-TW"/>
+        </w:rPr>
+        <w:t>〇</w:t>
+      </w:r>
+      <w:r>
+        <w:rPr>
+          <w:rFonts w:ascii="新細明體" w:eastAsia="新細明體" w:hAnsi="新細明體"/>
+          <w:lang w:eastAsia="zh-TW"/>
+        </w:rPr>
+        <w:t>號令修正公布之政府採購法第二十二條第一項規定，符合該條第一項各款情形之採購，得採限制性招標，免報經上級機關核准。說明二第十三款為現行條文第十六款。</w:t>
       </w:r>
     </w:p>
     <w:p>
@@ -15070,7 +15728,35 @@
           <w:rFonts w:ascii="新細明體" w:eastAsia="新細明體" w:hAnsi="新細明體"/>
           <w:lang w:eastAsia="zh-TW"/>
         </w:rPr>
-        <w:t>一、復貴公司八十八年八月三十日電材字第八八Ｏ八－一五ＯＯ號函。</w:t>
+        <w:t>一、復貴公司八十八年八月三十日電材字第八八</w:t>
+      </w:r>
+      <w:r>
+        <w:rPr>
+          <w:rFonts w:ascii="新細明體" w:eastAsia="新細明體" w:hAnsi="新細明體"/>
+          <w:lang w:eastAsia="zh-TW"/>
+        </w:rPr>
+        <w:t>〇</w:t>
+      </w:r>
+      <w:r>
+        <w:rPr>
+          <w:rFonts w:ascii="新細明體" w:eastAsia="新細明體" w:hAnsi="新細明體"/>
+          <w:lang w:eastAsia="zh-TW"/>
+        </w:rPr>
+        <w:t>八－一五</w:t>
+      </w:r>
+      <w:r>
+        <w:rPr>
+          <w:rFonts w:ascii="新細明體" w:eastAsia="新細明體" w:hAnsi="新細明體"/>
+          <w:lang w:eastAsia="zh-TW"/>
+        </w:rPr>
+        <w:t>〇〇</w:t>
+      </w:r>
+      <w:r>
+        <w:rPr>
+          <w:rFonts w:ascii="新細明體" w:eastAsia="新細明體" w:hAnsi="新細明體"/>
+          <w:lang w:eastAsia="zh-TW"/>
+        </w:rPr>
+        <w:t>號函。</w:t>
       </w:r>
     </w:p>
     <w:p>
@@ -15163,7 +15849,21 @@
           <w:rFonts w:ascii="新細明體" w:eastAsia="新細明體" w:hAnsi="新細明體"/>
           <w:lang w:eastAsia="zh-TW"/>
         </w:rPr>
-        <w:t>說明：復貴部八十八年九月四日台(八八)內社字第八八九三六三二號函及九月十六日台(八八)內社字第八八八五三五Ｏ號函。</w:t>
+        <w:t>說明：復貴部八十八年九月四日台(八八)內社字第八八九三六三二號函及九月十六日台(八八)內社字第八八八五三五</w:t>
+      </w:r>
+      <w:r>
+        <w:rPr>
+          <w:rFonts w:ascii="新細明體" w:eastAsia="新細明體" w:hAnsi="新細明體"/>
+          <w:lang w:eastAsia="zh-TW"/>
+        </w:rPr>
+        <w:t>〇</w:t>
+      </w:r>
+      <w:r>
+        <w:rPr>
+          <w:rFonts w:ascii="新細明體" w:eastAsia="新細明體" w:hAnsi="新細明體"/>
+          <w:lang w:eastAsia="zh-TW"/>
+        </w:rPr>
+        <w:t>號函。</w:t>
       </w:r>
     </w:p>
     <w:p>
@@ -15180,7 +15880,49 @@
           <w:rFonts w:ascii="新細明體" w:eastAsia="新細明體" w:hAnsi="新細明體"/>
           <w:lang w:eastAsia="zh-TW"/>
         </w:rPr>
-        <w:t>備註：1. 依九十一年二月六日總統華總一義字第Ｏ九一ＯＯＯ二五六一Ｏ號令修正公布之政府採購法第二十二條第一項規定，符合該條第一項各款情形之採購，得採限制性招標，免報經上級機關核准。</w:t>
+        <w:t>備註：1. 依九十一年二月六日總統華總一義字第</w:t>
+      </w:r>
+      <w:r>
+        <w:rPr>
+          <w:rFonts w:ascii="新細明體" w:eastAsia="新細明體" w:hAnsi="新細明體"/>
+          <w:lang w:eastAsia="zh-TW"/>
+        </w:rPr>
+        <w:t>〇</w:t>
+      </w:r>
+      <w:r>
+        <w:rPr>
+          <w:rFonts w:ascii="新細明體" w:eastAsia="新細明體" w:hAnsi="新細明體"/>
+          <w:lang w:eastAsia="zh-TW"/>
+        </w:rPr>
+        <w:t>九一</w:t>
+      </w:r>
+      <w:r>
+        <w:rPr>
+          <w:rFonts w:ascii="新細明體" w:eastAsia="新細明體" w:hAnsi="新細明體"/>
+          <w:lang w:eastAsia="zh-TW"/>
+        </w:rPr>
+        <w:t>〇〇〇</w:t>
+      </w:r>
+      <w:r>
+        <w:rPr>
+          <w:rFonts w:ascii="新細明體" w:eastAsia="新細明體" w:hAnsi="新細明體"/>
+          <w:lang w:eastAsia="zh-TW"/>
+        </w:rPr>
+        <w:t>二五六一</w:t>
+      </w:r>
+      <w:r>
+        <w:rPr>
+          <w:rFonts w:ascii="新細明體" w:eastAsia="新細明體" w:hAnsi="新細明體"/>
+          <w:lang w:eastAsia="zh-TW"/>
+        </w:rPr>
+        <w:t>〇</w:t>
+      </w:r>
+      <w:r>
+        <w:rPr>
+          <w:rFonts w:ascii="新細明體" w:eastAsia="新細明體" w:hAnsi="新細明體"/>
+          <w:lang w:eastAsia="zh-TW"/>
+        </w:rPr>
+        <w:t>號令修正公布之政府採購法第二十二條第一項規定，符合該條第一項各款情形之採購，得採限制性招標，免報經上級機關核准。</w:t>
       </w:r>
     </w:p>
     <w:p>
@@ -15451,7 +16193,49 @@
           <w:rFonts w:ascii="新細明體" w:eastAsia="新細明體" w:hAnsi="新細明體"/>
           <w:lang w:eastAsia="zh-TW"/>
         </w:rPr>
-        <w:t>備註：1. 政府採購法部分條文於九十一年二月六日奉總統華總一義字第０九一０００二五六一０令修正公布，本函說明四「第二十二條第一項第十三款」已修正為「第二十二條第一項第十六款」，並刪除報經上級機關核准之規定。</w:t>
+        <w:t>備註：1. 政府採購法部分條文於九十一年二月六日奉總統華總一義字第</w:t>
+      </w:r>
+      <w:r>
+        <w:rPr>
+          <w:rFonts w:ascii="新細明體" w:eastAsia="新細明體" w:hAnsi="新細明體"/>
+          <w:lang w:eastAsia="zh-TW"/>
+        </w:rPr>
+        <w:t>〇</w:t>
+      </w:r>
+      <w:r>
+        <w:rPr>
+          <w:rFonts w:ascii="新細明體" w:eastAsia="新細明體" w:hAnsi="新細明體"/>
+          <w:lang w:eastAsia="zh-TW"/>
+        </w:rPr>
+        <w:t>九一</w:t>
+      </w:r>
+      <w:r>
+        <w:rPr>
+          <w:rFonts w:ascii="新細明體" w:eastAsia="新細明體" w:hAnsi="新細明體"/>
+          <w:lang w:eastAsia="zh-TW"/>
+        </w:rPr>
+        <w:t>〇〇〇</w:t>
+      </w:r>
+      <w:r>
+        <w:rPr>
+          <w:rFonts w:ascii="新細明體" w:eastAsia="新細明體" w:hAnsi="新細明體"/>
+          <w:lang w:eastAsia="zh-TW"/>
+        </w:rPr>
+        <w:t>二五六一</w:t>
+      </w:r>
+      <w:r>
+        <w:rPr>
+          <w:rFonts w:ascii="新細明體" w:eastAsia="新細明體" w:hAnsi="新細明體"/>
+          <w:lang w:eastAsia="zh-TW"/>
+        </w:rPr>
+        <w:t>〇</w:t>
+      </w:r>
+      <w:r>
+        <w:rPr>
+          <w:rFonts w:ascii="新細明體" w:eastAsia="新細明體" w:hAnsi="新細明體"/>
+          <w:lang w:eastAsia="zh-TW"/>
+        </w:rPr>
+        <w:t>令修正公布，本函說明四「第二十二條第一項第十三款」已修正為「第二十二條第一項第十六款」，並刪除報經上級機關核准之規定。</w:t>
       </w:r>
     </w:p>
     <w:p>
@@ -18379,7 +19163,21 @@
           <w:rFonts w:ascii="新細明體" w:eastAsia="新細明體" w:hAnsi="新細明體"/>
           <w:lang w:eastAsia="zh-TW"/>
         </w:rPr>
-        <w:t>一、復貴公司八十八年五月二十五日(八八)和業字第００三二號函。</w:t>
+        <w:t>一、復貴公司八十八年五月二十五日(八八)和業字第</w:t>
+      </w:r>
+      <w:r>
+        <w:rPr>
+          <w:rFonts w:ascii="新細明體" w:eastAsia="新細明體" w:hAnsi="新細明體"/>
+          <w:lang w:eastAsia="zh-TW"/>
+        </w:rPr>
+        <w:t>〇〇</w:t>
+      </w:r>
+      <w:r>
+        <w:rPr>
+          <w:rFonts w:ascii="新細明體" w:eastAsia="新細明體" w:hAnsi="新細明體"/>
+          <w:lang w:eastAsia="zh-TW"/>
+        </w:rPr>
+        <w:t>三二號函。</w:t>
       </w:r>
     </w:p>
     <w:p>
@@ -19840,7 +20638,35 @@
           <w:rFonts w:ascii="新細明體" w:eastAsia="新細明體" w:hAnsi="新細明體"/>
           <w:lang w:eastAsia="zh-TW"/>
         </w:rPr>
-        <w:t>一、復貴府八十九年六月二十一日府工三字第八九０四九一二三００號函。</w:t>
+        <w:t>一、復貴府八十九年六月二十一日府工三字第八九</w:t>
+      </w:r>
+      <w:r>
+        <w:rPr>
+          <w:rFonts w:ascii="新細明體" w:eastAsia="新細明體" w:hAnsi="新細明體"/>
+          <w:lang w:eastAsia="zh-TW"/>
+        </w:rPr>
+        <w:t>〇</w:t>
+      </w:r>
+      <w:r>
+        <w:rPr>
+          <w:rFonts w:ascii="新細明體" w:eastAsia="新細明體" w:hAnsi="新細明體"/>
+          <w:lang w:eastAsia="zh-TW"/>
+        </w:rPr>
+        <w:t>四九一二三</w:t>
+      </w:r>
+      <w:r>
+        <w:rPr>
+          <w:rFonts w:ascii="新細明體" w:eastAsia="新細明體" w:hAnsi="新細明體"/>
+          <w:lang w:eastAsia="zh-TW"/>
+        </w:rPr>
+        <w:t>〇〇</w:t>
+      </w:r>
+      <w:r>
+        <w:rPr>
+          <w:rFonts w:ascii="新細明體" w:eastAsia="新細明體" w:hAnsi="新細明體"/>
+          <w:lang w:eastAsia="zh-TW"/>
+        </w:rPr>
+        <w:t>號函。</w:t>
       </w:r>
     </w:p>
     <w:p>
@@ -20909,7 +21735,35 @@
           <w:rFonts w:ascii="新細明體" w:eastAsia="新細明體" w:hAnsi="新細明體"/>
           <w:lang w:eastAsia="zh-TW"/>
         </w:rPr>
-        <w:t>一、復貴府八十八年六月十日(八八)投府社福字第Ｏ九Ｏ六三四號函。</w:t>
+        <w:t>一、復貴府八十八年六月十日(八八)投府社福字第</w:t>
+      </w:r>
+      <w:r>
+        <w:rPr>
+          <w:rFonts w:ascii="新細明體" w:eastAsia="新細明體" w:hAnsi="新細明體"/>
+          <w:lang w:eastAsia="zh-TW"/>
+        </w:rPr>
+        <w:t>〇</w:t>
+      </w:r>
+      <w:r>
+        <w:rPr>
+          <w:rFonts w:ascii="新細明體" w:eastAsia="新細明體" w:hAnsi="新細明體"/>
+          <w:lang w:eastAsia="zh-TW"/>
+        </w:rPr>
+        <w:t>九</w:t>
+      </w:r>
+      <w:r>
+        <w:rPr>
+          <w:rFonts w:ascii="新細明體" w:eastAsia="新細明體" w:hAnsi="新細明體"/>
+          <w:lang w:eastAsia="zh-TW"/>
+        </w:rPr>
+        <w:t>〇</w:t>
+      </w:r>
+      <w:r>
+        <w:rPr>
+          <w:rFonts w:ascii="新細明體" w:eastAsia="新細明體" w:hAnsi="新細明體"/>
+          <w:lang w:eastAsia="zh-TW"/>
+        </w:rPr>
+        <w:t>六三四號函。</w:t>
       </w:r>
     </w:p>
     <w:p>
@@ -21070,7 +21924,49 @@
           <w:rFonts w:ascii="新細明體" w:eastAsia="新細明體" w:hAnsi="新細明體"/>
           <w:lang w:eastAsia="zh-TW"/>
         </w:rPr>
-        <w:t>備註：1. 政府採購法部分條文於九十一年二月六日奉總統華總一義字第０九一０００二五六一０號令修正公布，本函說明三第六條第一項及第二項已合併修正為第一項。</w:t>
+        <w:t>備註：1. 政府採購法部分條文於九十一年二月六日奉總統華總一義字第</w:t>
+      </w:r>
+      <w:r>
+        <w:rPr>
+          <w:rFonts w:ascii="新細明體" w:eastAsia="新細明體" w:hAnsi="新細明體"/>
+          <w:lang w:eastAsia="zh-TW"/>
+        </w:rPr>
+        <w:t>〇</w:t>
+      </w:r>
+      <w:r>
+        <w:rPr>
+          <w:rFonts w:ascii="新細明體" w:eastAsia="新細明體" w:hAnsi="新細明體"/>
+          <w:lang w:eastAsia="zh-TW"/>
+        </w:rPr>
+        <w:t>九一</w:t>
+      </w:r>
+      <w:r>
+        <w:rPr>
+          <w:rFonts w:ascii="新細明體" w:eastAsia="新細明體" w:hAnsi="新細明體"/>
+          <w:lang w:eastAsia="zh-TW"/>
+        </w:rPr>
+        <w:t>〇〇〇</w:t>
+      </w:r>
+      <w:r>
+        <w:rPr>
+          <w:rFonts w:ascii="新細明體" w:eastAsia="新細明體" w:hAnsi="新細明體"/>
+          <w:lang w:eastAsia="zh-TW"/>
+        </w:rPr>
+        <w:t>二五六一</w:t>
+      </w:r>
+      <w:r>
+        <w:rPr>
+          <w:rFonts w:ascii="新細明體" w:eastAsia="新細明體" w:hAnsi="新細明體"/>
+          <w:lang w:eastAsia="zh-TW"/>
+        </w:rPr>
+        <w:t>〇</w:t>
+      </w:r>
+      <w:r>
+        <w:rPr>
+          <w:rFonts w:ascii="新細明體" w:eastAsia="新細明體" w:hAnsi="新細明體"/>
+          <w:lang w:eastAsia="zh-TW"/>
+        </w:rPr>
+        <w:t>號令修正公布，本函說明三第六條第一項及第二項已合併修正為第一項。</w:t>
       </w:r>
     </w:p>
     <w:p>
@@ -21087,7 +21983,49 @@
           <w:rFonts w:ascii="新細明體" w:eastAsia="新細明體" w:hAnsi="新細明體"/>
           <w:lang w:eastAsia="zh-TW"/>
         </w:rPr>
-        <w:t>2. 政府採購法部分條文於九十一年二月六日奉　總統華總一義字第０九一０００二五六一０號令修正公布，本函說明三第六條第一項及第二項已合併修正為第一項。</w:t>
+        <w:t>2. 政府採購法部分條文於九十一年二月六日奉　總統華總一義字第</w:t>
+      </w:r>
+      <w:r>
+        <w:rPr>
+          <w:rFonts w:ascii="新細明體" w:eastAsia="新細明體" w:hAnsi="新細明體"/>
+          <w:lang w:eastAsia="zh-TW"/>
+        </w:rPr>
+        <w:t>〇</w:t>
+      </w:r>
+      <w:r>
+        <w:rPr>
+          <w:rFonts w:ascii="新細明體" w:eastAsia="新細明體" w:hAnsi="新細明體"/>
+          <w:lang w:eastAsia="zh-TW"/>
+        </w:rPr>
+        <w:t>九一</w:t>
+      </w:r>
+      <w:r>
+        <w:rPr>
+          <w:rFonts w:ascii="新細明體" w:eastAsia="新細明體" w:hAnsi="新細明體"/>
+          <w:lang w:eastAsia="zh-TW"/>
+        </w:rPr>
+        <w:t>〇〇〇</w:t>
+      </w:r>
+      <w:r>
+        <w:rPr>
+          <w:rFonts w:ascii="新細明體" w:eastAsia="新細明體" w:hAnsi="新細明體"/>
+          <w:lang w:eastAsia="zh-TW"/>
+        </w:rPr>
+        <w:t>二五六一</w:t>
+      </w:r>
+      <w:r>
+        <w:rPr>
+          <w:rFonts w:ascii="新細明體" w:eastAsia="新細明體" w:hAnsi="新細明體"/>
+          <w:lang w:eastAsia="zh-TW"/>
+        </w:rPr>
+        <w:t>〇</w:t>
+      </w:r>
+      <w:r>
+        <w:rPr>
+          <w:rFonts w:ascii="新細明體" w:eastAsia="新細明體" w:hAnsi="新細明體"/>
+          <w:lang w:eastAsia="zh-TW"/>
+        </w:rPr>
+        <w:t>號令修正公布，本函說明三第六條第一項及第二項已合併修正為第一項。</w:t>
       </w:r>
     </w:p>
     <w:p>
@@ -22082,7 +23020,21 @@
           <w:rFonts w:ascii="新細明體" w:eastAsia="新細明體" w:hAnsi="新細明體"/>
           <w:lang w:eastAsia="zh-TW"/>
         </w:rPr>
-        <w:t>一、復貴部八十八年六月三日台(八八)總(二)字第八八Ｏ六二一九二號函。</w:t>
+        <w:t>一、復貴部八十八年六月三日台(八八)總(二)字第八八</w:t>
+      </w:r>
+      <w:r>
+        <w:rPr>
+          <w:rFonts w:ascii="新細明體" w:eastAsia="新細明體" w:hAnsi="新細明體"/>
+          <w:lang w:eastAsia="zh-TW"/>
+        </w:rPr>
+        <w:t>〇</w:t>
+      </w:r>
+      <w:r>
+        <w:rPr>
+          <w:rFonts w:ascii="新細明體" w:eastAsia="新細明體" w:hAnsi="新細明體"/>
+          <w:lang w:eastAsia="zh-TW"/>
+        </w:rPr>
+        <w:t>六二一九二號函。</w:t>
       </w:r>
     </w:p>
     <w:p>
@@ -22302,7 +23254,35 @@
           <w:rFonts w:ascii="新細明體" w:eastAsia="新細明體" w:hAnsi="新細明體"/>
           <w:lang w:eastAsia="zh-TW"/>
         </w:rPr>
-        <w:t>一、復貴公司八十八年六月八日電公字第八八Ｏ六-Ｏ三八五號函。</w:t>
+        <w:t>一、復貴公司八十八年六月八日電公字第八八</w:t>
+      </w:r>
+      <w:r>
+        <w:rPr>
+          <w:rFonts w:ascii="新細明體" w:eastAsia="新細明體" w:hAnsi="新細明體"/>
+          <w:lang w:eastAsia="zh-TW"/>
+        </w:rPr>
+        <w:t>〇</w:t>
+      </w:r>
+      <w:r>
+        <w:rPr>
+          <w:rFonts w:ascii="新細明體" w:eastAsia="新細明體" w:hAnsi="新細明體"/>
+          <w:lang w:eastAsia="zh-TW"/>
+        </w:rPr>
+        <w:t>六-</w:t>
+      </w:r>
+      <w:r>
+        <w:rPr>
+          <w:rFonts w:ascii="新細明體" w:eastAsia="新細明體" w:hAnsi="新細明體"/>
+          <w:lang w:eastAsia="zh-TW"/>
+        </w:rPr>
+        <w:t>〇</w:t>
+      </w:r>
+      <w:r>
+        <w:rPr>
+          <w:rFonts w:ascii="新細明體" w:eastAsia="新細明體" w:hAnsi="新細明體"/>
+          <w:lang w:eastAsia="zh-TW"/>
+        </w:rPr>
+        <w:t>三八五號函。</w:t>
       </w:r>
     </w:p>
     <w:p>
@@ -22886,7 +23866,21 @@
           <w:rFonts w:ascii="新細明體" w:eastAsia="新細明體" w:hAnsi="新細明體"/>
           <w:lang w:eastAsia="zh-TW"/>
         </w:rPr>
-        <w:t>一、復貴會八十八年八月二日八十八僑一綜字第ＯＯ三九二六號函。</w:t>
+        <w:t>一、復貴會八十八年八月二日八十八僑一綜字第</w:t>
+      </w:r>
+      <w:r>
+        <w:rPr>
+          <w:rFonts w:ascii="新細明體" w:eastAsia="新細明體" w:hAnsi="新細明體"/>
+          <w:lang w:eastAsia="zh-TW"/>
+        </w:rPr>
+        <w:t>〇〇</w:t>
+      </w:r>
+      <w:r>
+        <w:rPr>
+          <w:rFonts w:ascii="新細明體" w:eastAsia="新細明體" w:hAnsi="新細明體"/>
+          <w:lang w:eastAsia="zh-TW"/>
+        </w:rPr>
+        <w:t>三九二六號函。</w:t>
       </w:r>
     </w:p>
     <w:p>
@@ -23513,7 +24507,49 @@
           <w:rFonts w:ascii="新細明體" w:eastAsia="新細明體" w:hAnsi="新細明體"/>
           <w:lang w:eastAsia="zh-TW"/>
         </w:rPr>
-        <w:t>備註：1. 依九十一年二月六日總統華總一義字第Ｏ九一ＯＯＯ二五六一Ｏ號令修正公布之政府採購法第二十二條第一項規定，符合該條第一項各款情形之採購，得採限制性招標，免報經上級機關核准。</w:t>
+        <w:t>備註：1. 依九十一年二月六日總統華總一義字第</w:t>
+      </w:r>
+      <w:r>
+        <w:rPr>
+          <w:rFonts w:ascii="新細明體" w:eastAsia="新細明體" w:hAnsi="新細明體"/>
+          <w:lang w:eastAsia="zh-TW"/>
+        </w:rPr>
+        <w:t>〇</w:t>
+      </w:r>
+      <w:r>
+        <w:rPr>
+          <w:rFonts w:ascii="新細明體" w:eastAsia="新細明體" w:hAnsi="新細明體"/>
+          <w:lang w:eastAsia="zh-TW"/>
+        </w:rPr>
+        <w:t>九一</w:t>
+      </w:r>
+      <w:r>
+        <w:rPr>
+          <w:rFonts w:ascii="新細明體" w:eastAsia="新細明體" w:hAnsi="新細明體"/>
+          <w:lang w:eastAsia="zh-TW"/>
+        </w:rPr>
+        <w:t>〇〇〇</w:t>
+      </w:r>
+      <w:r>
+        <w:rPr>
+          <w:rFonts w:ascii="新細明體" w:eastAsia="新細明體" w:hAnsi="新細明體"/>
+          <w:lang w:eastAsia="zh-TW"/>
+        </w:rPr>
+        <w:t>二五六一</w:t>
+      </w:r>
+      <w:r>
+        <w:rPr>
+          <w:rFonts w:ascii="新細明體" w:eastAsia="新細明體" w:hAnsi="新細明體"/>
+          <w:lang w:eastAsia="zh-TW"/>
+        </w:rPr>
+        <w:t>〇</w:t>
+      </w:r>
+      <w:r>
+        <w:rPr>
+          <w:rFonts w:ascii="新細明體" w:eastAsia="新細明體" w:hAnsi="新細明體"/>
+          <w:lang w:eastAsia="zh-TW"/>
+        </w:rPr>
+        <w:t>號令修正公布之政府採購法第二十二條第一項規定，符合該條第一項各款情形之採購，得採限制性招標，免報經上級機關核准。</w:t>
       </w:r>
     </w:p>
     <w:p>
@@ -23733,7 +24769,35 @@
           <w:rFonts w:ascii="新細明體" w:eastAsia="新細明體" w:hAnsi="新細明體"/>
           <w:lang w:eastAsia="zh-TW"/>
         </w:rPr>
-        <w:t>一、復貴局八十八年九月二十八日北市都一字第八八二二一０七五００號函。</w:t>
+        <w:t>一、復貴局八十八年九月二十八日北市都一字第八八二二一</w:t>
+      </w:r>
+      <w:r>
+        <w:rPr>
+          <w:rFonts w:ascii="新細明體" w:eastAsia="新細明體" w:hAnsi="新細明體"/>
+          <w:lang w:eastAsia="zh-TW"/>
+        </w:rPr>
+        <w:t>〇</w:t>
+      </w:r>
+      <w:r>
+        <w:rPr>
+          <w:rFonts w:ascii="新細明體" w:eastAsia="新細明體" w:hAnsi="新細明體"/>
+          <w:lang w:eastAsia="zh-TW"/>
+        </w:rPr>
+        <w:t>七五</w:t>
+      </w:r>
+      <w:r>
+        <w:rPr>
+          <w:rFonts w:ascii="新細明體" w:eastAsia="新細明體" w:hAnsi="新細明體"/>
+          <w:lang w:eastAsia="zh-TW"/>
+        </w:rPr>
+        <w:t>〇〇</w:t>
+      </w:r>
+      <w:r>
+        <w:rPr>
+          <w:rFonts w:ascii="新細明體" w:eastAsia="新細明體" w:hAnsi="新細明體"/>
+          <w:lang w:eastAsia="zh-TW"/>
+        </w:rPr>
+        <w:t>號函。</w:t>
       </w:r>
     </w:p>
     <w:p>
@@ -25254,7 +26318,35 @@
           <w:rFonts w:ascii="新細明體" w:eastAsia="新細明體" w:hAnsi="新細明體"/>
           <w:lang w:eastAsia="zh-TW"/>
         </w:rPr>
-        <w:t>說明：復貴社八十八年九月廿九日基市大中合字第０八０七號函。</w:t>
+        <w:t>說明：復貴社八十八年九月廿九日基市大中合字第</w:t>
+      </w:r>
+      <w:r>
+        <w:rPr>
+          <w:rFonts w:ascii="新細明體" w:eastAsia="新細明體" w:hAnsi="新細明體"/>
+          <w:lang w:eastAsia="zh-TW"/>
+        </w:rPr>
+        <w:t>〇</w:t>
+      </w:r>
+      <w:r>
+        <w:rPr>
+          <w:rFonts w:ascii="新細明體" w:eastAsia="新細明體" w:hAnsi="新細明體"/>
+          <w:lang w:eastAsia="zh-TW"/>
+        </w:rPr>
+        <w:t>八</w:t>
+      </w:r>
+      <w:r>
+        <w:rPr>
+          <w:rFonts w:ascii="新細明體" w:eastAsia="新細明體" w:hAnsi="新細明體"/>
+          <w:lang w:eastAsia="zh-TW"/>
+        </w:rPr>
+        <w:t>〇</w:t>
+      </w:r>
+      <w:r>
+        <w:rPr>
+          <w:rFonts w:ascii="新細明體" w:eastAsia="新細明體" w:hAnsi="新細明體"/>
+          <w:lang w:eastAsia="zh-TW"/>
+        </w:rPr>
+        <w:t>七號函。</w:t>
       </w:r>
     </w:p>
     <w:p>
@@ -27300,7 +28392,21 @@
           <w:rFonts w:ascii="新細明體" w:eastAsia="新細明體" w:hAnsi="新細明體"/>
           <w:lang w:eastAsia="zh-TW"/>
         </w:rPr>
-        <w:t>說明：復貴所八十八年八月二十三日八十八觀技北字第０００九四號函。</w:t>
+        <w:t>說明：復貴所八十八年八月二十三日八十八觀技北字第</w:t>
+      </w:r>
+      <w:r>
+        <w:rPr>
+          <w:rFonts w:ascii="新細明體" w:eastAsia="新細明體" w:hAnsi="新細明體"/>
+          <w:lang w:eastAsia="zh-TW"/>
+        </w:rPr>
+        <w:t>〇〇〇</w:t>
+      </w:r>
+      <w:r>
+        <w:rPr>
+          <w:rFonts w:ascii="新細明體" w:eastAsia="新細明體" w:hAnsi="新細明體"/>
+          <w:lang w:eastAsia="zh-TW"/>
+        </w:rPr>
+        <w:t>九四號函。</w:t>
       </w:r>
     </w:p>
     <w:p>
@@ -27435,24 +28541,52 @@
           <w:rFonts w:ascii="新細明體" w:eastAsia="新細明體" w:hAnsi="新細明體"/>
           <w:lang w:eastAsia="zh-TW"/>
         </w:rPr>
-        <w:t>一、復貴府八十九年一月五日八九北府工養字第ＯＯ六五八六號函。</w:t>
-      </w:r>
-    </w:p>
-    <w:p>
-      <w:pPr>
-        <w:pStyle w:val="a9"/>
-        <w:ind w:hanging="480"/>
-        <w:jc w:val="both"/>
-        <w:rPr>
-          <w:lang w:eastAsia="zh-TW"/>
-        </w:rPr>
-      </w:pPr>
-      <w:r>
-        <w:rPr>
-          <w:rFonts w:ascii="新細明體" w:eastAsia="新細明體" w:hAnsi="新細明體"/>
-          <w:lang w:eastAsia="zh-TW"/>
-        </w:rPr>
-        <w:t>二、機關依本法第四十條規定洽由其他具有專業能力之機關代辦採購，依本法第四十六條之規定，其底價應由洽辦機關之機關首長或其授權人員核定；並得依本法施行細則第四十二條第一項第五款「洽辦機關得行使之職權或應辦理之事項，得由代辦機關代為行使或辦理」之規定辦理。本會八十八年七月八日（八八）工程企字第八八Ｏ九四三二號函附件第五點答復內容並未限制上開施行細則條款之適用。</w:t>
+        <w:t>一、復貴府八十九年一月五日八九北府工養字第</w:t>
+      </w:r>
+      <w:r>
+        <w:rPr>
+          <w:rFonts w:ascii="新細明體" w:eastAsia="新細明體" w:hAnsi="新細明體"/>
+          <w:lang w:eastAsia="zh-TW"/>
+        </w:rPr>
+        <w:t>〇〇</w:t>
+      </w:r>
+      <w:r>
+        <w:rPr>
+          <w:rFonts w:ascii="新細明體" w:eastAsia="新細明體" w:hAnsi="新細明體"/>
+          <w:lang w:eastAsia="zh-TW"/>
+        </w:rPr>
+        <w:t>六五八六號函。</w:t>
+      </w:r>
+    </w:p>
+    <w:p>
+      <w:pPr>
+        <w:pStyle w:val="a9"/>
+        <w:ind w:hanging="480"/>
+        <w:jc w:val="both"/>
+        <w:rPr>
+          <w:lang w:eastAsia="zh-TW"/>
+        </w:rPr>
+      </w:pPr>
+      <w:r>
+        <w:rPr>
+          <w:rFonts w:ascii="新細明體" w:eastAsia="新細明體" w:hAnsi="新細明體"/>
+          <w:lang w:eastAsia="zh-TW"/>
+        </w:rPr>
+        <w:t>二、機關依本法第四十條規定洽由其他具有專業能力之機關代辦採購，依本法第四十六條之規定，其底價應由洽辦機關之機關首長或其授權人員核定；並得依本法施行細則第四十二條第一項第五款「洽辦機關得行使之職權或應辦理之事項，得由代辦機關代為行使或辦理」之規定辦理。本會八十八年七月八日（八八）工程企字第八八</w:t>
+      </w:r>
+      <w:r>
+        <w:rPr>
+          <w:rFonts w:ascii="新細明體" w:eastAsia="新細明體" w:hAnsi="新細明體"/>
+          <w:lang w:eastAsia="zh-TW"/>
+        </w:rPr>
+        <w:t>〇</w:t>
+      </w:r>
+      <w:r>
+        <w:rPr>
+          <w:rFonts w:ascii="新細明體" w:eastAsia="新細明體" w:hAnsi="新細明體"/>
+          <w:lang w:eastAsia="zh-TW"/>
+        </w:rPr>
+        <w:t>九四三二號函附件第五點答復內容並未限制上開施行細則條款之適用。</w:t>
       </w:r>
     </w:p>
     <w:p>
@@ -27528,7 +28662,35 @@
           <w:rFonts w:ascii="新細明體" w:eastAsia="新細明體" w:hAnsi="新細明體"/>
           <w:lang w:eastAsia="zh-TW"/>
         </w:rPr>
-        <w:t>一、依據行政院九十一年九月十一日院臺工字第０９１００４２４４１號函辦理。</w:t>
+        <w:t>一、依據行政院九十一年九月十一日院臺工字第</w:t>
+      </w:r>
+      <w:r>
+        <w:rPr>
+          <w:rFonts w:ascii="新細明體" w:eastAsia="新細明體" w:hAnsi="新細明體"/>
+          <w:lang w:eastAsia="zh-TW"/>
+        </w:rPr>
+        <w:t>〇</w:t>
+      </w:r>
+      <w:r>
+        <w:rPr>
+          <w:rFonts w:ascii="新細明體" w:eastAsia="新細明體" w:hAnsi="新細明體"/>
+          <w:lang w:eastAsia="zh-TW"/>
+        </w:rPr>
+        <w:t>９１</w:t>
+      </w:r>
+      <w:r>
+        <w:rPr>
+          <w:rFonts w:ascii="新細明體" w:eastAsia="新細明體" w:hAnsi="新細明體"/>
+          <w:lang w:eastAsia="zh-TW"/>
+        </w:rPr>
+        <w:t>〇〇</w:t>
+      </w:r>
+      <w:r>
+        <w:rPr>
+          <w:rFonts w:ascii="新細明體" w:eastAsia="新細明體" w:hAnsi="新細明體"/>
+          <w:lang w:eastAsia="zh-TW"/>
+        </w:rPr>
+        <w:t>４２４４１號函辦理。</w:t>
       </w:r>
     </w:p>
     <w:p>
@@ -28812,7 +29974,21 @@
           <w:rFonts w:ascii="新細明體" w:eastAsia="新細明體" w:hAnsi="新細明體"/>
           <w:lang w:eastAsia="zh-TW"/>
         </w:rPr>
-        <w:t>三、依前揭各項規定辦理之採購，其採購金額屬公告金額十分之一以下之採購，可依「中央機關未達公告金額採購招標辦法」第三條規定辦理；屬未達公告金額但逾公告金額十分之一之採購，則可依「中央機關未達公告金額採購招標辦法」第二條規定辦理；至屬公告金額以上之採購，如符合本法第二十條規定之各款情形，報經上級機關核准，得採選擇性招標方式辦理，其中經常性採購依本法第二十一條第三項規定，應建立六家以上之合格廠商名單。附註：本會已於八十八年八月二十四日以（八八）工程企字第八八一二六Ｏ一號令修正發布「中央機關未達公告金額採購招標辦法」。</w:t>
+        <w:t>三、依前揭各項規定辦理之採購，其採購金額屬公告金額十分之一以下之採購，可依「中央機關未達公告金額採購招標辦法」第三條規定辦理；屬未達公告金額但逾公告金額十分之一之採購，則可依「中央機關未達公告金額採購招標辦法」第二條規定辦理；至屬公告金額以上之採購，如符合本法第二十條規定之各款情形，報經上級機關核准，得採選擇性招標方式辦理，其中經常性採購依本法第二十一條第三項規定，應建立六家以上之合格廠商名單。附註：本會已於八十八年八月二十四日以（八八）工程企字第八八一二六</w:t>
+      </w:r>
+      <w:r>
+        <w:rPr>
+          <w:rFonts w:ascii="新細明體" w:eastAsia="新細明體" w:hAnsi="新細明體"/>
+          <w:lang w:eastAsia="zh-TW"/>
+        </w:rPr>
+        <w:t>〇</w:t>
+      </w:r>
+      <w:r>
+        <w:rPr>
+          <w:rFonts w:ascii="新細明體" w:eastAsia="新細明體" w:hAnsi="新細明體"/>
+          <w:lang w:eastAsia="zh-TW"/>
+        </w:rPr>
+        <w:t>一號令修正發布「中央機關未達公告金額採購招標辦法」。</w:t>
       </w:r>
     </w:p>
     <w:p>
@@ -28998,7 +30174,21 @@
           <w:rFonts w:ascii="新細明體" w:eastAsia="新細明體" w:hAnsi="新細明體"/>
           <w:lang w:eastAsia="zh-TW"/>
         </w:rPr>
-        <w:t>一、復貴局八十八年七月十九日88高市環局修字第Ｏ二六四九七號函。</w:t>
+        <w:t>一、復貴局八十八年七月十九日88高市環局修字第</w:t>
+      </w:r>
+      <w:r>
+        <w:rPr>
+          <w:rFonts w:ascii="新細明體" w:eastAsia="新細明體" w:hAnsi="新細明體"/>
+          <w:lang w:eastAsia="zh-TW"/>
+        </w:rPr>
+        <w:t>〇</w:t>
+      </w:r>
+      <w:r>
+        <w:rPr>
+          <w:rFonts w:ascii="新細明體" w:eastAsia="新細明體" w:hAnsi="新細明體"/>
+          <w:lang w:eastAsia="zh-TW"/>
+        </w:rPr>
+        <w:t>二六四九七號函。</w:t>
       </w:r>
     </w:p>
     <w:p>
@@ -30071,7 +31261,49 @@
           <w:rFonts w:ascii="新細明體" w:eastAsia="新細明體" w:hAnsi="新細明體"/>
           <w:lang w:eastAsia="zh-TW"/>
         </w:rPr>
-        <w:t>備註：1. 政府採購法部分條文於九十一年二月六日奉總統華總一義字第０九一０００二五六一０令修正公布，本函附件內容七之（十三）答「第六條第二項」配合修正為「第六條第一項」；第六十九條為新修正第八十五條之一。</w:t>
+        <w:t>備註：1. 政府採購法部分條文於九十一年二月六日奉總統華總一義字第</w:t>
+      </w:r>
+      <w:r>
+        <w:rPr>
+          <w:rFonts w:ascii="新細明體" w:eastAsia="新細明體" w:hAnsi="新細明體"/>
+          <w:lang w:eastAsia="zh-TW"/>
+        </w:rPr>
+        <w:t>〇</w:t>
+      </w:r>
+      <w:r>
+        <w:rPr>
+          <w:rFonts w:ascii="新細明體" w:eastAsia="新細明體" w:hAnsi="新細明體"/>
+          <w:lang w:eastAsia="zh-TW"/>
+        </w:rPr>
+        <w:t>九一</w:t>
+      </w:r>
+      <w:r>
+        <w:rPr>
+          <w:rFonts w:ascii="新細明體" w:eastAsia="新細明體" w:hAnsi="新細明體"/>
+          <w:lang w:eastAsia="zh-TW"/>
+        </w:rPr>
+        <w:t>〇〇〇</w:t>
+      </w:r>
+      <w:r>
+        <w:rPr>
+          <w:rFonts w:ascii="新細明體" w:eastAsia="新細明體" w:hAnsi="新細明體"/>
+          <w:lang w:eastAsia="zh-TW"/>
+        </w:rPr>
+        <w:t>二五六一</w:t>
+      </w:r>
+      <w:r>
+        <w:rPr>
+          <w:rFonts w:ascii="新細明體" w:eastAsia="新細明體" w:hAnsi="新細明體"/>
+          <w:lang w:eastAsia="zh-TW"/>
+        </w:rPr>
+        <w:t>〇</w:t>
+      </w:r>
+      <w:r>
+        <w:rPr>
+          <w:rFonts w:ascii="新細明體" w:eastAsia="新細明體" w:hAnsi="新細明體"/>
+          <w:lang w:eastAsia="zh-TW"/>
+        </w:rPr>
+        <w:t>令修正公布，本函附件內容七之（十三）答「第六條第二項」配合修正為「第六條第一項」；第六十九條為新修正第八十五條之一。</w:t>
       </w:r>
     </w:p>
     <w:p>
@@ -30655,7 +31887,21 @@
           <w:rFonts w:ascii="新細明體" w:eastAsia="新細明體" w:hAnsi="新細明體"/>
           <w:lang w:eastAsia="zh-TW"/>
         </w:rPr>
-        <w:t>說明：復貴公所八十八年八月三十日八八肚鄉托字第一一ＯＯＯ號函。</w:t>
+        <w:t>說明：復貴公所八十八年八月三十日八八肚鄉托字第一一</w:t>
+      </w:r>
+      <w:r>
+        <w:rPr>
+          <w:rFonts w:ascii="新細明體" w:eastAsia="新細明體" w:hAnsi="新細明體"/>
+          <w:lang w:eastAsia="zh-TW"/>
+        </w:rPr>
+        <w:t>〇〇〇</w:t>
+      </w:r>
+      <w:r>
+        <w:rPr>
+          <w:rFonts w:ascii="新細明體" w:eastAsia="新細明體" w:hAnsi="新細明體"/>
+          <w:lang w:eastAsia="zh-TW"/>
+        </w:rPr>
+        <w:t>號函。</w:t>
       </w:r>
     </w:p>
     <w:p>
@@ -31281,7 +32527,49 @@
           <w:rFonts w:ascii="新細明體" w:eastAsia="新細明體" w:hAnsi="新細明體"/>
           <w:lang w:eastAsia="zh-TW"/>
         </w:rPr>
-        <w:t>一、依據中華民國認證委員會九十二年九月二日認字第０九二００００二三八０號函辦理。</w:t>
+        <w:t>一、依據中華民國認證委員會九十二年九月二日認字第</w:t>
+      </w:r>
+      <w:r>
+        <w:rPr>
+          <w:rFonts w:ascii="新細明體" w:eastAsia="新細明體" w:hAnsi="新細明體"/>
+          <w:lang w:eastAsia="zh-TW"/>
+        </w:rPr>
+        <w:t>〇</w:t>
+      </w:r>
+      <w:r>
+        <w:rPr>
+          <w:rFonts w:ascii="新細明體" w:eastAsia="新細明體" w:hAnsi="新細明體"/>
+          <w:lang w:eastAsia="zh-TW"/>
+        </w:rPr>
+        <w:t>九二</w:t>
+      </w:r>
+      <w:r>
+        <w:rPr>
+          <w:rFonts w:ascii="新細明體" w:eastAsia="新細明體" w:hAnsi="新細明體"/>
+          <w:lang w:eastAsia="zh-TW"/>
+        </w:rPr>
+        <w:t>〇〇〇〇</w:t>
+      </w:r>
+      <w:r>
+        <w:rPr>
+          <w:rFonts w:ascii="新細明體" w:eastAsia="新細明體" w:hAnsi="新細明體"/>
+          <w:lang w:eastAsia="zh-TW"/>
+        </w:rPr>
+        <w:t>二三八</w:t>
+      </w:r>
+      <w:r>
+        <w:rPr>
+          <w:rFonts w:ascii="新細明體" w:eastAsia="新細明體" w:hAnsi="新細明體"/>
+          <w:lang w:eastAsia="zh-TW"/>
+        </w:rPr>
+        <w:t>〇</w:t>
+      </w:r>
+      <w:r>
+        <w:rPr>
+          <w:rFonts w:ascii="新細明體" w:eastAsia="新細明體" w:hAnsi="新細明體"/>
+          <w:lang w:eastAsia="zh-TW"/>
+        </w:rPr>
+        <w:t>號函辦理。</w:t>
       </w:r>
     </w:p>
     <w:p>
@@ -31577,7 +32865,21 @@
           <w:rFonts w:ascii="新細明體" w:eastAsia="新細明體" w:hAnsi="新細明體"/>
           <w:lang w:eastAsia="zh-TW"/>
         </w:rPr>
-        <w:t>一、復貴公司八十八年五月二十五日(八八)和業字第００三二號函。</w:t>
+        <w:t>一、復貴公司八十八年五月二十五日(八八)和業字第</w:t>
+      </w:r>
+      <w:r>
+        <w:rPr>
+          <w:rFonts w:ascii="新細明體" w:eastAsia="新細明體" w:hAnsi="新細明體"/>
+          <w:lang w:eastAsia="zh-TW"/>
+        </w:rPr>
+        <w:t>〇〇</w:t>
+      </w:r>
+      <w:r>
+        <w:rPr>
+          <w:rFonts w:ascii="新細明體" w:eastAsia="新細明體" w:hAnsi="新細明體"/>
+          <w:lang w:eastAsia="zh-TW"/>
+        </w:rPr>
+        <w:t>三二號函。</w:t>
       </w:r>
     </w:p>
     <w:p>
@@ -31814,7 +33116,49 @@
           <w:rFonts w:ascii="新細明體" w:eastAsia="新細明體" w:hAnsi="新細明體"/>
           <w:lang w:eastAsia="zh-TW"/>
         </w:rPr>
-        <w:t>備註：1. 依九十一年二月六日總統華總一義字第Ｏ九一ＯＯＯ二五六一Ｏ號令修正公布之政府採購法第二十二條第一項規定，符合該條第一項各款情形之採購，得採限制性招標，免報經上級機關核准。</w:t>
+        <w:t>備註：1. 依九十一年二月六日總統華總一義字第</w:t>
+      </w:r>
+      <w:r>
+        <w:rPr>
+          <w:rFonts w:ascii="新細明體" w:eastAsia="新細明體" w:hAnsi="新細明體"/>
+          <w:lang w:eastAsia="zh-TW"/>
+        </w:rPr>
+        <w:t>〇</w:t>
+      </w:r>
+      <w:r>
+        <w:rPr>
+          <w:rFonts w:ascii="新細明體" w:eastAsia="新細明體" w:hAnsi="新細明體"/>
+          <w:lang w:eastAsia="zh-TW"/>
+        </w:rPr>
+        <w:t>九一</w:t>
+      </w:r>
+      <w:r>
+        <w:rPr>
+          <w:rFonts w:ascii="新細明體" w:eastAsia="新細明體" w:hAnsi="新細明體"/>
+          <w:lang w:eastAsia="zh-TW"/>
+        </w:rPr>
+        <w:t>〇〇〇</w:t>
+      </w:r>
+      <w:r>
+        <w:rPr>
+          <w:rFonts w:ascii="新細明體" w:eastAsia="新細明體" w:hAnsi="新細明體"/>
+          <w:lang w:eastAsia="zh-TW"/>
+        </w:rPr>
+        <w:t>二五六一</w:t>
+      </w:r>
+      <w:r>
+        <w:rPr>
+          <w:rFonts w:ascii="新細明體" w:eastAsia="新細明體" w:hAnsi="新細明體"/>
+          <w:lang w:eastAsia="zh-TW"/>
+        </w:rPr>
+        <w:t>〇</w:t>
+      </w:r>
+      <w:r>
+        <w:rPr>
+          <w:rFonts w:ascii="新細明體" w:eastAsia="新細明體" w:hAnsi="新細明體"/>
+          <w:lang w:eastAsia="zh-TW"/>
+        </w:rPr>
+        <w:t>號令修正公布之政府採購法第二十二條第一項規定，符合該條第一項各款情形之採購，得採限制性招標，免報經上級機關核准。</w:t>
       </w:r>
     </w:p>
     <w:p>
@@ -34187,24 +35531,80 @@
           <w:rFonts w:ascii="新細明體" w:eastAsia="新細明體" w:hAnsi="新細明體"/>
           <w:lang w:eastAsia="zh-TW"/>
         </w:rPr>
-        <w:t>一、復貴校九十一年九月九日塗小總字第０九一０００六六二００號函。</w:t>
-      </w:r>
-    </w:p>
-    <w:p>
-      <w:pPr>
-        <w:pStyle w:val="a9"/>
-        <w:ind w:hanging="480"/>
-        <w:jc w:val="both"/>
-        <w:rPr>
-          <w:lang w:eastAsia="zh-TW"/>
-        </w:rPr>
-      </w:pPr>
-      <w:r>
-        <w:rPr>
-          <w:rFonts w:ascii="新細明體" w:eastAsia="新細明體" w:hAnsi="新細明體"/>
-          <w:lang w:eastAsia="zh-TW"/>
-        </w:rPr>
-        <w:t>二、有關營業項目乙節，請參閱本會九十年十二月廿六日(九十)工程企字第九００五一四八四號函附會議紀錄（已公開於本會網站）。三、目前政府財政困難，各機關使用預算辦理採購，本應依編定該預算之原始目的撙節開支。貴校利用旨揭剩餘款採購宣導Ｔ侐及資料袋(公事包)是否妥適，請審慎檢討。</w:t>
+        <w:t>一、復貴校九十一年九月九日塗小總字第</w:t>
+      </w:r>
+      <w:r>
+        <w:rPr>
+          <w:rFonts w:ascii="新細明體" w:eastAsia="新細明體" w:hAnsi="新細明體"/>
+          <w:lang w:eastAsia="zh-TW"/>
+        </w:rPr>
+        <w:t>〇</w:t>
+      </w:r>
+      <w:r>
+        <w:rPr>
+          <w:rFonts w:ascii="新細明體" w:eastAsia="新細明體" w:hAnsi="新細明體"/>
+          <w:lang w:eastAsia="zh-TW"/>
+        </w:rPr>
+        <w:t>九一</w:t>
+      </w:r>
+      <w:r>
+        <w:rPr>
+          <w:rFonts w:ascii="新細明體" w:eastAsia="新細明體" w:hAnsi="新細明體"/>
+          <w:lang w:eastAsia="zh-TW"/>
+        </w:rPr>
+        <w:t>〇〇〇</w:t>
+      </w:r>
+      <w:r>
+        <w:rPr>
+          <w:rFonts w:ascii="新細明體" w:eastAsia="新細明體" w:hAnsi="新細明體"/>
+          <w:lang w:eastAsia="zh-TW"/>
+        </w:rPr>
+        <w:t>六六二</w:t>
+      </w:r>
+      <w:r>
+        <w:rPr>
+          <w:rFonts w:ascii="新細明體" w:eastAsia="新細明體" w:hAnsi="新細明體"/>
+          <w:lang w:eastAsia="zh-TW"/>
+        </w:rPr>
+        <w:t>〇〇</w:t>
+      </w:r>
+      <w:r>
+        <w:rPr>
+          <w:rFonts w:ascii="新細明體" w:eastAsia="新細明體" w:hAnsi="新細明體"/>
+          <w:lang w:eastAsia="zh-TW"/>
+        </w:rPr>
+        <w:t>號函。</w:t>
+      </w:r>
+    </w:p>
+    <w:p>
+      <w:pPr>
+        <w:pStyle w:val="a9"/>
+        <w:ind w:hanging="480"/>
+        <w:jc w:val="both"/>
+        <w:rPr>
+          <w:lang w:eastAsia="zh-TW"/>
+        </w:rPr>
+      </w:pPr>
+      <w:r>
+        <w:rPr>
+          <w:rFonts w:ascii="新細明體" w:eastAsia="新細明體" w:hAnsi="新細明體"/>
+          <w:lang w:eastAsia="zh-TW"/>
+        </w:rPr>
+        <w:t>二、有關營業項目乙節，請參閱本會九十年十二月廿六日(九十)工程企字第九</w:t>
+      </w:r>
+      <w:r>
+        <w:rPr>
+          <w:rFonts w:ascii="新細明體" w:eastAsia="新細明體" w:hAnsi="新細明體"/>
+          <w:lang w:eastAsia="zh-TW"/>
+        </w:rPr>
+        <w:t>〇〇</w:t>
+      </w:r>
+      <w:r>
+        <w:rPr>
+          <w:rFonts w:ascii="新細明體" w:eastAsia="新細明體" w:hAnsi="新細明體"/>
+          <w:lang w:eastAsia="zh-TW"/>
+        </w:rPr>
+        <w:t>五一四八四號函附會議紀錄（已公開於本會網站）。三、目前政府財政困難，各機關使用預算辦理採購，本應依編定該預算之原始目的撙節開支。貴校利用旨揭剩餘款採購宣導Ｔ侐及資料袋(公事包)是否妥適，請審慎檢討。</w:t>
       </w:r>
     </w:p>
     <w:p>
@@ -35094,7 +36494,35 @@
           <w:rFonts w:ascii="新細明體" w:eastAsia="新細明體" w:hAnsi="新細明體"/>
           <w:lang w:eastAsia="zh-TW"/>
         </w:rPr>
-        <w:t>一、復貴局九十三年二月五日新廣三字第０九二００二三二七三號函。</w:t>
+        <w:t>一、復貴局九十三年二月五日新廣三字第</w:t>
+      </w:r>
+      <w:r>
+        <w:rPr>
+          <w:rFonts w:ascii="新細明體" w:eastAsia="新細明體" w:hAnsi="新細明體"/>
+          <w:lang w:eastAsia="zh-TW"/>
+        </w:rPr>
+        <w:t>〇</w:t>
+      </w:r>
+      <w:r>
+        <w:rPr>
+          <w:rFonts w:ascii="新細明體" w:eastAsia="新細明體" w:hAnsi="新細明體"/>
+          <w:lang w:eastAsia="zh-TW"/>
+        </w:rPr>
+        <w:t>九二</w:t>
+      </w:r>
+      <w:r>
+        <w:rPr>
+          <w:rFonts w:ascii="新細明體" w:eastAsia="新細明體" w:hAnsi="新細明體"/>
+          <w:lang w:eastAsia="zh-TW"/>
+        </w:rPr>
+        <w:t>〇〇</w:t>
+      </w:r>
+      <w:r>
+        <w:rPr>
+          <w:rFonts w:ascii="新細明體" w:eastAsia="新細明體" w:hAnsi="新細明體"/>
+          <w:lang w:eastAsia="zh-TW"/>
+        </w:rPr>
+        <w:t>二三二七三號函。</w:t>
       </w:r>
     </w:p>
     <w:p>
@@ -42831,7 +44259,21 @@
           <w:rFonts w:ascii="新細明體" w:eastAsia="新細明體" w:hAnsi="新細明體"/>
           <w:lang w:eastAsia="zh-TW"/>
         </w:rPr>
-        <w:t>一、復貴局八十八年六月二十八日標檢(八八)四字第一四七Ｏ五號函。</w:t>
+        <w:t>一、復貴局八十八年六月二十八日標檢(八八)四字第一四七</w:t>
+      </w:r>
+      <w:r>
+        <w:rPr>
+          <w:rFonts w:ascii="新細明體" w:eastAsia="新細明體" w:hAnsi="新細明體"/>
+          <w:lang w:eastAsia="zh-TW"/>
+        </w:rPr>
+        <w:t>〇</w:t>
+      </w:r>
+      <w:r>
+        <w:rPr>
+          <w:rFonts w:ascii="新細明體" w:eastAsia="新細明體" w:hAnsi="新細明體"/>
+          <w:lang w:eastAsia="zh-TW"/>
+        </w:rPr>
+        <w:t>五號函。</w:t>
       </w:r>
     </w:p>
     <w:p>
@@ -50805,7 +52247,35 @@
           <w:rFonts w:ascii="新細明體" w:eastAsia="新細明體" w:hAnsi="新細明體"/>
           <w:lang w:eastAsia="zh-TW"/>
         </w:rPr>
-        <w:t>一、復貴府九十三年六月二十五日府行庶字第０９３０１２１３２７號函。</w:t>
+        <w:t>一、復貴府九十三年六月二十五日府行庶字第</w:t>
+      </w:r>
+      <w:r>
+        <w:rPr>
+          <w:rFonts w:ascii="新細明體" w:eastAsia="新細明體" w:hAnsi="新細明體"/>
+          <w:lang w:eastAsia="zh-TW"/>
+        </w:rPr>
+        <w:t>〇</w:t>
+      </w:r>
+      <w:r>
+        <w:rPr>
+          <w:rFonts w:ascii="新細明體" w:eastAsia="新細明體" w:hAnsi="新細明體"/>
+          <w:lang w:eastAsia="zh-TW"/>
+        </w:rPr>
+        <w:t>９３</w:t>
+      </w:r>
+      <w:r>
+        <w:rPr>
+          <w:rFonts w:ascii="新細明體" w:eastAsia="新細明體" w:hAnsi="新細明體"/>
+          <w:lang w:eastAsia="zh-TW"/>
+        </w:rPr>
+        <w:t>〇</w:t>
+      </w:r>
+      <w:r>
+        <w:rPr>
+          <w:rFonts w:ascii="新細明體" w:eastAsia="新細明體" w:hAnsi="新細明體"/>
+          <w:lang w:eastAsia="zh-TW"/>
+        </w:rPr>
+        <w:t>１２１３２７號函。</w:t>
       </w:r>
     </w:p>
     <w:p>

</xml_diff>